<commit_message>
Tesi: aggiunto il paragrafo 2.2.2 sul massaggio miofasciale di pianta del piede e catene
Nuovo paragrafo esplicito su che cos'è il massaggio miofasciale, perché è indicato nel
piede piatto-pronato e come si applica sull'aponeurosi plantare, sugli intrinseci e lungo
la linea superficiale posteriore, laterale e profonda, con auto-rilascio e precauzioni.
Aggiunte note e voci bibliografiche (Stecco, Schleip, Barnes, Manheim, Ajimsha, Grieve).
Per restare entro le 30 pagine sono stati accorciati i paragrafi 1.4 e 2.1, rimossa la
tabella riassuntiva e una fotografia.

Co-Authored-By: Claude Fable 5.1 <noreply@anthropic.com>
Claude-Session: https://claude.ai/code/session_01HaSZBG5Aw3aa4NUFu1QzTU
</commit_message>
<xml_diff>
--- a/tesi/Tesi_Bacci_Piede_piatto_pronato_danza_classica.docx
+++ b/tesi/Tesi_Bacci_Piede_piatto_pronato_danza_classica.docx
@@ -697,7 +697,7 @@
           <w:sz w:val="24"/>
           <w:szCs w:val="24"/>
         </w:rPr>
-        <w:t xml:space="preserve">1.4.3 Problematiche posturali	20</w:t>
+        <w:t xml:space="preserve">1.4.3 Problematiche posturali	19</w:t>
       </w:r>
     </w:p>
     <w:p>
@@ -716,7 +716,7 @@
           <w:sz w:val="24"/>
           <w:szCs w:val="24"/>
         </w:rPr>
-        <w:t xml:space="preserve">1.4.4 Problematiche funzionali	21</w:t>
+        <w:t xml:space="preserve">1.4.4 Problematiche funzionali	20</w:t>
       </w:r>
     </w:p>
     <w:p>
@@ -735,7 +735,7 @@
           <w:sz w:val="24"/>
           <w:szCs w:val="24"/>
         </w:rPr>
-        <w:t xml:space="preserve">CAPITOLO 2 – DESCRIZIONE PRATICA DELL’ARGOMENTO	22</w:t>
+        <w:t xml:space="preserve">CAPITOLO 2 – DESCRIZIONE PRATICA DELL’ARGOMENTO	21</w:t>
       </w:r>
     </w:p>
     <w:p>
@@ -754,7 +754,7 @@
           <w:sz w:val="24"/>
           <w:szCs w:val="24"/>
         </w:rPr>
-        <w:t xml:space="preserve">2.1 Descrizione del protocollo/trattamento massoterapico	22</w:t>
+        <w:t xml:space="preserve">2.1 Descrizione del protocollo/trattamento massoterapico	21</w:t>
       </w:r>
     </w:p>
     <w:p>
@@ -773,7 +773,7 @@
           <w:sz w:val="24"/>
           <w:szCs w:val="24"/>
         </w:rPr>
-        <w:t xml:space="preserve">2.1.1 Prima fase: catena posteriore della gamba (decubito prono)	23</w:t>
+        <w:t xml:space="preserve">2.1.1 Prima fase: catena posteriore della gamba (decubito prono)	22</w:t>
       </w:r>
     </w:p>
     <w:p>
@@ -792,7 +792,7 @@
           <w:sz w:val="24"/>
           <w:szCs w:val="24"/>
         </w:rPr>
-        <w:t xml:space="preserve">2.1.2 Seconda fase: la pianta del piede	23</w:t>
+        <w:t xml:space="preserve">2.1.2 Seconda fase: la pianta del piede	22</w:t>
       </w:r>
     </w:p>
     <w:p>
@@ -811,7 +811,7 @@
           <w:sz w:val="24"/>
           <w:szCs w:val="24"/>
         </w:rPr>
-        <w:t xml:space="preserve">2.1.3 Terza fase: compartimenti laterale e anteriore e dorso del piede (decubito supino)	24</w:t>
+        <w:t xml:space="preserve">2.1.3 Terza fase: compartimenti laterale e anteriore e dorso del piede (decubito supino)	23</w:t>
       </w:r>
     </w:p>
     <w:p>
@@ -830,7 +830,7 @@
           <w:sz w:val="24"/>
           <w:szCs w:val="24"/>
         </w:rPr>
-        <w:t xml:space="preserve">2.1.4 Quarta fase: anca, bacino e integrazione	24</w:t>
+        <w:t xml:space="preserve">2.1.4 Quarta fase: anca, bacino e integrazione	23</w:t>
       </w:r>
     </w:p>
     <w:p>
@@ -849,7 +849,7 @@
           <w:sz w:val="24"/>
           <w:szCs w:val="24"/>
         </w:rPr>
-        <w:t xml:space="preserve">2.2 Descrizione delle tecniche complementari	25</w:t>
+        <w:t xml:space="preserve">2.2 Descrizione delle tecniche complementari	23</w:t>
       </w:r>
     </w:p>
     <w:p>
@@ -868,7 +868,7 @@
           <w:sz w:val="24"/>
           <w:szCs w:val="24"/>
         </w:rPr>
-        <w:t xml:space="preserve">2.2.1 Mobilizzazioni articolari	25</w:t>
+        <w:t xml:space="preserve">2.2.1 Mobilizzazioni articolari	23</w:t>
       </w:r>
     </w:p>
     <w:p>
@@ -887,7 +887,7 @@
           <w:sz w:val="24"/>
           <w:szCs w:val="24"/>
         </w:rPr>
-        <w:t xml:space="preserve">2.2.2 Esercizio attivo e rieducazione dell’appoggio	25</w:t>
+        <w:t xml:space="preserve">2.2.2 Massaggio miofasciale della pianta del piede e delle catene	24</w:t>
       </w:r>
     </w:p>
     <w:p>
@@ -906,7 +906,26 @@
           <w:sz w:val="24"/>
           <w:szCs w:val="24"/>
         </w:rPr>
-        <w:t xml:space="preserve">2.2.3 Integrazione con il gesto tecnico ed educazione al carico	26</w:t>
+        <w:t xml:space="preserve">2.2.3 Esercizio attivo e rieducazione dell’appoggio	26</w:t>
+      </w:r>
+    </w:p>
+    <w:p>
+      <w:pPr>
+        <w:tabs>
+          <w:tab w:val="right" w:pos="8505" w:leader="dot"/>
+        </w:tabs>
+        <w:spacing w:after="40" w:line="276"/>
+        <w:ind w:left="680" w:right="567" w:hanging="0"/>
+      </w:pPr>
+      <w:r>
+        <w:rPr>
+          <w:rFonts w:ascii="Times New Roman" w:cs="Times New Roman" w:eastAsia="Times New Roman" w:hAnsi="Times New Roman"/>
+          <w:b w:val="false"/>
+          <w:bCs w:val="false"/>
+          <w:sz w:val="24"/>
+          <w:szCs w:val="24"/>
+        </w:rPr>
+        <w:t xml:space="preserve">2.2.4 Integrazione con il gesto tecnico ed educazione al carico	26</w:t>
       </w:r>
     </w:p>
     <w:p>
@@ -3467,7 +3486,7 @@
           <w:sz w:val="24"/>
           <w:szCs w:val="24"/>
         </w:rPr>
-        <w:t xml:space="preserve"> richiede un’ampia dorsiflessione della caviglia a ginocchio flesso, mantenendo il ginocchio allineato sopra il secondo dito; il </w:t>
+        <w:t xml:space="preserve"> richiede un’ampia dorsiflessione a ginocchio flesso con il ginocchio allineato sul secondo dito; il </w:t>
       </w:r>
       <w:r>
         <w:rPr>
@@ -3485,7 +3504,7 @@
           <w:sz w:val="24"/>
           <w:szCs w:val="24"/>
         </w:rPr>
-        <w:t xml:space="preserve"> e la mezza punta richiedono un’estensione della prima metatarso-falangea di circa 90°, un controllo attivo del retropiede in posizione neutra e una flessione plantare della caviglia sufficiente a portare il piede “in linea” con la gamba; il lavoro sulle punte richiede una flessione plantare complessiva di circa 90-100°, con il carico concentrato sulla scatola della scarpetta e trasmesso attraverso l’alluce e il secondo dito. I salti e le ricezioni, ripetuti decine di volte per lezione, impongono a piede e caviglia forze di reazione del suolo stimate fino a quattro-cinque volte il peso corporeo e sollecitano eccentricamente tricipite surale e tibiale posteriore.</w:t>
+        <w:t xml:space="preserve"> richiede circa 90° di estensione della prima metatarso-falangea e un controllo attivo del retropiede in neutro; le punte richiedono una flessione plantare complessiva di 90-100°, con il carico trasmesso attraverso l’alluce e il secondo dito. I salti, ripetuti decine di volte per lezione, impongono a piede e caviglia forze fino a quattro-cinque volte il peso corporeo e sollecitano eccentricamente tricipite surale e tibiale posteriore.</w:t>
       </w:r>
       <w:r>
         <w:rPr>
@@ -3499,7 +3518,7 @@
           <w:sz w:val="24"/>
           <w:szCs w:val="24"/>
         </w:rPr>
-        <w:t xml:space="preserve"> La letteratura colloca al piede e alla caviglia la quota più alta degli infortuni dei danzatori, prevalentemente da sovraccarico; tra i fattori di rischio figurano il volume di allenamento, la fatica, l’introduzione precoce delle punte, le scarpette, il </w:t>
+        <w:t xml:space="preserve"> Piede e caviglia sono la sede più frequente degli infortuni dei danzatori, prevalentemente da sovraccarico; tra i fattori di rischio figurano volume di allenamento, fatica, introduzione precoce delle punte, scarpette, </w:t>
       </w:r>
       <w:r>
         <w:rPr>
@@ -3517,7 +3536,7 @@
           <w:sz w:val="24"/>
           <w:szCs w:val="24"/>
         </w:rPr>
-        <w:t xml:space="preserve"> compensato e la morfologia del piede, incluso il piede pronato.</w:t>
+        <w:t xml:space="preserve"> compensato e morfologia del piede, incluso il piede pronato.</w:t>
       </w:r>
       <w:r>
         <w:rPr>
@@ -3549,7 +3568,41 @@
           <w:sz w:val="24"/>
           <w:szCs w:val="24"/>
         </w:rPr>
-        <w:t xml:space="preserve">, riduce l’efficienza del salto e aumenta il lavoro degli stabilizzatori dinamici a ogni lezione.</w:t>
+        <w:t xml:space="preserve"> e aumenta il lavoro degli stabilizzatori a ogni lezione.</w:t>
+      </w:r>
+    </w:p>
+    <w:p>
+      <w:pPr>
+        <w:pStyle w:val="Heading3"/>
+        <w:keepNext/>
+        <w:spacing w:after="100" w:before="180" w:line="360"/>
+      </w:pPr>
+      <w:r>
+        <w:rPr>
+          <w:rFonts w:ascii="Times New Roman" w:cs="Times New Roman" w:eastAsia="Times New Roman" w:hAnsi="Times New Roman"/>
+          <w:b/>
+          <w:bCs/>
+          <w:i/>
+          <w:iCs/>
+          <w:color w:val="000000"/>
+          <w:sz w:val="24"/>
+          <w:szCs w:val="24"/>
+        </w:rPr>
+        <w:t xml:space="preserve">1.4.2 Problematiche anatomiche e lesioni da sovraccarico</w:t>
+      </w:r>
+    </w:p>
+    <w:p>
+      <w:pPr>
+        <w:spacing w:after="120" w:line="360"/>
+        <w:jc w:val="both"/>
+      </w:pPr>
+      <w:r>
+        <w:rPr>
+          <w:rFonts w:ascii="Times New Roman" w:cs="Times New Roman" w:eastAsia="Times New Roman" w:hAnsi="Times New Roman"/>
+          <w:sz w:val="24"/>
+          <w:szCs w:val="24"/>
+        </w:rPr>
+        <w:t xml:space="preserve">Le problematiche anatomiche più frequenti nel danzatore con piede piatto-pronato riguardano la colonna mediale e le strutture che la sostengono.</w:t>
       </w:r>
     </w:p>
     <w:p>
@@ -3561,7 +3614,7 @@
       <w:r>
         <w:drawing>
           <wp:inline distT="0" distB="0" distL="0" distR="0">
-            <wp:extent cx="2162175" cy="1362075"/>
+            <wp:extent cx="2162175" cy="1485900"/>
             <wp:effectExtent t="0" r="0" b="0" l="0"/>
             <wp:docPr id="1" name="" descr="" title=""/>
             <wp:cNvGraphicFramePr>
@@ -3586,7 +3639,7 @@
                   <pic:spPr bwMode="auto">
                     <a:xfrm>
                       <a:off x="0" y="0"/>
-                      <a:ext cx="2162175" cy="1362075"/>
+                      <a:ext cx="2162175" cy="1485900"/>
                     </a:xfrm>
                     <a:prstGeom prst="rect">
                       <a:avLst/>
@@ -3612,7 +3665,284 @@
           <w:sz w:val="20"/>
           <w:szCs w:val="20"/>
         </w:rPr>
-        <w:t xml:space="preserve">Figura 8 – Il lavoro alla sbarra: turnout, plié e relevé.</w:t>
+        <w:t xml:space="preserve">Figura 8 – Il lavoro sulle punte concentra il carico su alluce, sesamoidi e flessore lungo dell’alluce.</w:t>
+      </w:r>
+    </w:p>
+    <w:p>
+      <w:pPr>
+        <w:pStyle w:val="ListParagraph"/>
+        <w:numPr>
+          <w:ilvl w:val="0"/>
+          <w:numId w:val="2"/>
+        </w:numPr>
+        <w:spacing w:after="80" w:line="360"/>
+        <w:jc w:val="both"/>
+      </w:pPr>
+      <w:r>
+        <w:rPr>
+          <w:rFonts w:ascii="Times New Roman" w:cs="Times New Roman" w:eastAsia="Times New Roman" w:hAnsi="Times New Roman"/>
+          <w:sz w:val="24"/>
+          <w:szCs w:val="24"/>
+        </w:rPr>
+        <w:t xml:space="preserve">Tendinopatia del tibiale posteriore: il muscolo lavora eccentricamente a ogni ricezione e concentricamente a ogni </w:t>
+      </w:r>
+      <w:r>
+        <w:rPr>
+          <w:rFonts w:ascii="Times New Roman" w:cs="Times New Roman" w:eastAsia="Times New Roman" w:hAnsi="Times New Roman"/>
+          <w:i/>
+          <w:iCs/>
+          <w:sz w:val="24"/>
+          <w:szCs w:val="24"/>
+        </w:rPr>
+        <w:t xml:space="preserve">relevé</w:t>
+      </w:r>
+      <w:r>
+        <w:rPr>
+          <w:rFonts w:ascii="Times New Roman" w:cs="Times New Roman" w:eastAsia="Times New Roman" w:hAnsi="Times New Roman"/>
+          <w:sz w:val="24"/>
+          <w:szCs w:val="24"/>
+        </w:rPr>
+        <w:t xml:space="preserve"> per riportare il retropiede in neutro, e nel piede pronato la richiesta è maggiore. Il dolore è retromalleolare mediale e sul navicolare, aumenta con il </w:t>
+      </w:r>
+      <w:r>
+        <w:rPr>
+          <w:rFonts w:ascii="Times New Roman" w:cs="Times New Roman" w:eastAsia="Times New Roman" w:hAnsi="Times New Roman"/>
+          <w:i/>
+          <w:iCs/>
+          <w:sz w:val="24"/>
+          <w:szCs w:val="24"/>
+        </w:rPr>
+        <w:t xml:space="preserve">relevé</w:t>
+      </w:r>
+      <w:r>
+        <w:rPr>
+          <w:rFonts w:ascii="Times New Roman" w:cs="Times New Roman" w:eastAsia="Times New Roman" w:hAnsi="Times New Roman"/>
+          <w:sz w:val="24"/>
+          <w:szCs w:val="24"/>
+        </w:rPr>
+        <w:t xml:space="preserve"> monopodalico e può evolvere verso la disfunzione descritta nel paragrafo 1.3.2.</w:t>
+      </w:r>
+    </w:p>
+    <w:p>
+      <w:pPr>
+        <w:pStyle w:val="ListParagraph"/>
+        <w:numPr>
+          <w:ilvl w:val="0"/>
+          <w:numId w:val="2"/>
+        </w:numPr>
+        <w:spacing w:after="80" w:line="360"/>
+        <w:jc w:val="both"/>
+      </w:pPr>
+      <w:r>
+        <w:rPr>
+          <w:rFonts w:ascii="Times New Roman" w:cs="Times New Roman" w:eastAsia="Times New Roman" w:hAnsi="Times New Roman"/>
+          <w:sz w:val="24"/>
+          <w:szCs w:val="24"/>
+        </w:rPr>
+        <w:t xml:space="preserve">Tendinopatia del flessore lungo dell’alluce (“tendinite del danzatore”): il tendine scorre in un tunnel osteofibroso dietro l’astragalo; la flessione plantare estrema delle punte e la pronazione, che lo angola, provocano attrito, infiammazione della guaina e talvolta un nodulo con scatto. Il dolore è postero-mediale, provocato dalla flessione dell’alluce contro resistenza.</w:t>
+      </w:r>
+      <w:r>
+        <w:rPr>
+          <w:rStyle w:val="FootnoteReference"/>
+        </w:rPr>
+        <w:footnoteReference w:id="38"/>
+      </w:r>
+    </w:p>
+    <w:p>
+      <w:pPr>
+        <w:pStyle w:val="ListParagraph"/>
+        <w:numPr>
+          <w:ilvl w:val="0"/>
+          <w:numId w:val="2"/>
+        </w:numPr>
+        <w:spacing w:after="80" w:line="360"/>
+        <w:jc w:val="both"/>
+      </w:pPr>
+      <w:r>
+        <w:rPr>
+          <w:rFonts w:ascii="Times New Roman" w:cs="Times New Roman" w:eastAsia="Times New Roman" w:hAnsi="Times New Roman"/>
+          <w:sz w:val="24"/>
+          <w:szCs w:val="24"/>
+        </w:rPr>
+        <w:t xml:space="preserve">Conflitto posteriore della caviglia e </w:t>
+      </w:r>
+      <w:r>
+        <w:rPr>
+          <w:rFonts w:ascii="Times New Roman" w:cs="Times New Roman" w:eastAsia="Times New Roman" w:hAnsi="Times New Roman"/>
+          <w:i/>
+          <w:iCs/>
+          <w:sz w:val="24"/>
+          <w:szCs w:val="24"/>
+        </w:rPr>
+        <w:t xml:space="preserve">os trigonum</w:t>
+      </w:r>
+      <w:r>
+        <w:rPr>
+          <w:rFonts w:ascii="Times New Roman" w:cs="Times New Roman" w:eastAsia="Times New Roman" w:hAnsi="Times New Roman"/>
+          <w:sz w:val="24"/>
+          <w:szCs w:val="24"/>
+        </w:rPr>
+        <w:t xml:space="preserve">: la flessione plantare estrema schiaccia i tessuti posteriori tra tibia e calcagno; un </w:t>
+      </w:r>
+      <w:r>
+        <w:rPr>
+          <w:rFonts w:ascii="Times New Roman" w:cs="Times New Roman" w:eastAsia="Times New Roman" w:hAnsi="Times New Roman"/>
+          <w:i/>
+          <w:iCs/>
+          <w:sz w:val="24"/>
+          <w:szCs w:val="24"/>
+        </w:rPr>
+        <w:t xml:space="preserve">os trigonum</w:t>
+      </w:r>
+      <w:r>
+        <w:rPr>
+          <w:rFonts w:ascii="Times New Roman" w:cs="Times New Roman" w:eastAsia="Times New Roman" w:hAnsi="Times New Roman"/>
+          <w:sz w:val="24"/>
+          <w:szCs w:val="24"/>
+        </w:rPr>
+        <w:t xml:space="preserve"> (presente in circa il 10% della popolazione) o un processo posteriore dell’astragalo prominente provocano dolore posteriore nel </w:t>
+      </w:r>
+      <w:r>
+        <w:rPr>
+          <w:rFonts w:ascii="Times New Roman" w:cs="Times New Roman" w:eastAsia="Times New Roman" w:hAnsi="Times New Roman"/>
+          <w:i/>
+          <w:iCs/>
+          <w:sz w:val="24"/>
+          <w:szCs w:val="24"/>
+        </w:rPr>
+        <w:t xml:space="preserve">relevé</w:t>
+      </w:r>
+      <w:r>
+        <w:rPr>
+          <w:rFonts w:ascii="Times New Roman" w:cs="Times New Roman" w:eastAsia="Times New Roman" w:hAnsi="Times New Roman"/>
+          <w:sz w:val="24"/>
+          <w:szCs w:val="24"/>
+        </w:rPr>
+        <w:t xml:space="preserve"> e sulle punte, mentre il conflitto anteriore limita e rende doloroso il </w:t>
+      </w:r>
+      <w:r>
+        <w:rPr>
+          <w:rFonts w:ascii="Times New Roman" w:cs="Times New Roman" w:eastAsia="Times New Roman" w:hAnsi="Times New Roman"/>
+          <w:i/>
+          <w:iCs/>
+          <w:sz w:val="24"/>
+          <w:szCs w:val="24"/>
+        </w:rPr>
+        <w:t xml:space="preserve">plié</w:t>
+      </w:r>
+      <w:r>
+        <w:rPr>
+          <w:rFonts w:ascii="Times New Roman" w:cs="Times New Roman" w:eastAsia="Times New Roman" w:hAnsi="Times New Roman"/>
+          <w:sz w:val="24"/>
+          <w:szCs w:val="24"/>
+        </w:rPr>
+        <w:t xml:space="preserve">.</w:t>
+      </w:r>
+      <w:r>
+        <w:rPr>
+          <w:rStyle w:val="FootnoteReference"/>
+        </w:rPr>
+        <w:footnoteReference w:id="39"/>
+      </w:r>
+    </w:p>
+    <w:p>
+      <w:pPr>
+        <w:pStyle w:val="ListParagraph"/>
+        <w:numPr>
+          <w:ilvl w:val="0"/>
+          <w:numId w:val="2"/>
+        </w:numPr>
+        <w:spacing w:after="80" w:line="360"/>
+        <w:jc w:val="both"/>
+      </w:pPr>
+      <w:r>
+        <w:rPr>
+          <w:rFonts w:ascii="Times New Roman" w:cs="Times New Roman" w:eastAsia="Times New Roman" w:hAnsi="Times New Roman"/>
+          <w:sz w:val="24"/>
+          <w:szCs w:val="24"/>
+        </w:rPr>
+        <w:t xml:space="preserve">Alluce valgo, alluce rigido e sesamoiditi: la pronazione sposta il carico sul margine mediale dell’avampiede e favorisce la deviazione dell’alluce; punte e mezza punta sovraccaricano i sesamoidi e la prima metatarso-falangea, limitando l’estensione necessaria al </w:t>
+      </w:r>
+      <w:r>
+        <w:rPr>
+          <w:rFonts w:ascii="Times New Roman" w:cs="Times New Roman" w:eastAsia="Times New Roman" w:hAnsi="Times New Roman"/>
+          <w:i/>
+          <w:iCs/>
+          <w:sz w:val="24"/>
+          <w:szCs w:val="24"/>
+        </w:rPr>
+        <w:t xml:space="preserve">relevé</w:t>
+      </w:r>
+      <w:r>
+        <w:rPr>
+          <w:rFonts w:ascii="Times New Roman" w:cs="Times New Roman" w:eastAsia="Times New Roman" w:hAnsi="Times New Roman"/>
+          <w:sz w:val="24"/>
+          <w:szCs w:val="24"/>
+        </w:rPr>
+        <w:t xml:space="preserve">.</w:t>
+      </w:r>
+    </w:p>
+    <w:p>
+      <w:pPr>
+        <w:pStyle w:val="ListParagraph"/>
+        <w:numPr>
+          <w:ilvl w:val="0"/>
+          <w:numId w:val="2"/>
+        </w:numPr>
+        <w:spacing w:after="80" w:line="360"/>
+        <w:jc w:val="both"/>
+      </w:pPr>
+      <w:r>
+        <w:rPr>
+          <w:rFonts w:ascii="Times New Roman" w:cs="Times New Roman" w:eastAsia="Times New Roman" w:hAnsi="Times New Roman"/>
+          <w:sz w:val="24"/>
+          <w:szCs w:val="24"/>
+        </w:rPr>
+        <w:t xml:space="preserve">Fratture da stress: il secondo metatarso, soprattutto alla base, è la sede classica nel danzatore sulle punte, perché il piede pronato con primo raggio ipermobile trasferisce il carico sul secondo raggio; sono descritte anche fratture del navicolare e della tibia distale. Il dolore che aumenta con il carico e persiste a riposo richiede un invio immediato.</w:t>
+      </w:r>
+      <w:r>
+        <w:rPr>
+          <w:rStyle w:val="FootnoteReference"/>
+        </w:rPr>
+        <w:footnoteReference w:id="40"/>
+      </w:r>
+    </w:p>
+    <w:p>
+      <w:pPr>
+        <w:pStyle w:val="ListParagraph"/>
+        <w:numPr>
+          <w:ilvl w:val="0"/>
+          <w:numId w:val="2"/>
+        </w:numPr>
+        <w:spacing w:after="80" w:line="360"/>
+        <w:jc w:val="both"/>
+      </w:pPr>
+      <w:r>
+        <w:rPr>
+          <w:rFonts w:ascii="Times New Roman" w:cs="Times New Roman" w:eastAsia="Times New Roman" w:hAnsi="Times New Roman"/>
+          <w:sz w:val="24"/>
+          <w:szCs w:val="24"/>
+        </w:rPr>
+        <w:t xml:space="preserve">Fascite plantare, tendinopatia d’Achille e sindrome da stress tibiale mediale, legate alla pronazione prolungata e al sovraccarico eccentrico della catena posteriore (paragrafo 1.3.4).</w:t>
+      </w:r>
+    </w:p>
+    <w:p>
+      <w:pPr>
+        <w:pStyle w:val="ListParagraph"/>
+        <w:numPr>
+          <w:ilvl w:val="0"/>
+          <w:numId w:val="2"/>
+        </w:numPr>
+        <w:spacing w:after="80" w:line="360"/>
+        <w:jc w:val="both"/>
+      </w:pPr>
+      <w:r>
+        <w:rPr>
+          <w:rFonts w:ascii="Times New Roman" w:cs="Times New Roman" w:eastAsia="Times New Roman" w:hAnsi="Times New Roman"/>
+          <w:sz w:val="24"/>
+          <w:szCs w:val="24"/>
+        </w:rPr>
+        <w:t xml:space="preserve">Distorsioni laterali e instabilità cronica della caviglia: frequenti nelle ricezioni in flessione plantare, coinvolgono soprattutto il legamento peroneo-astragalico anteriore e, ripetendosi, peggiorano l’afferenza propriocettiva e il controllo del retropiede; vi si associa spesso la sindrome del cuboide, con dolore laterale del mesopiede.</w:t>
       </w:r>
     </w:p>
     <w:p>
@@ -3632,7 +3962,7 @@
           <w:sz w:val="24"/>
           <w:szCs w:val="24"/>
         </w:rPr>
-        <w:t xml:space="preserve">1.4.2 Problematiche anatomiche e lesioni da sovraccarico</w:t>
+        <w:t xml:space="preserve">1.4.3 Problematiche posturali</w:t>
       </w:r>
     </w:p>
     <w:p>
@@ -3646,7 +3976,201 @@
           <w:sz w:val="24"/>
           <w:szCs w:val="24"/>
         </w:rPr>
-        <w:t xml:space="preserve">Le problematiche anatomiche più frequenti nel danzatore con piede piatto-pronato riguardano la colonna mediale e le strutture che la sostengono.</w:t>
+        <w:t xml:space="preserve">Sul piano posturale il quadro più caratteristico è il </w:t>
+      </w:r>
+      <w:r>
+        <w:rPr>
+          <w:rFonts w:ascii="Times New Roman" w:cs="Times New Roman" w:eastAsia="Times New Roman" w:hAnsi="Times New Roman"/>
+          <w:i/>
+          <w:iCs/>
+          <w:sz w:val="24"/>
+          <w:szCs w:val="24"/>
+        </w:rPr>
+        <w:t xml:space="preserve">rolling in</w:t>
+      </w:r>
+      <w:r>
+        <w:rPr>
+          <w:rFonts w:ascii="Times New Roman" w:cs="Times New Roman" w:eastAsia="Times New Roman" w:hAnsi="Times New Roman"/>
+          <w:sz w:val="24"/>
+          <w:szCs w:val="24"/>
+        </w:rPr>
+        <w:t xml:space="preserve">: il danzatore, per raggiungere il </w:t>
+      </w:r>
+      <w:r>
+        <w:rPr>
+          <w:rFonts w:ascii="Times New Roman" w:cs="Times New Roman" w:eastAsia="Times New Roman" w:hAnsi="Times New Roman"/>
+          <w:i/>
+          <w:iCs/>
+          <w:sz w:val="24"/>
+          <w:szCs w:val="24"/>
+        </w:rPr>
+        <w:t xml:space="preserve">turnout</w:t>
+      </w:r>
+      <w:r>
+        <w:rPr>
+          <w:rFonts w:ascii="Times New Roman" w:cs="Times New Roman" w:eastAsia="Times New Roman" w:hAnsi="Times New Roman"/>
+          <w:sz w:val="24"/>
+          <w:szCs w:val="24"/>
+        </w:rPr>
+        <w:t xml:space="preserve"> richiesto, ruota esternamente la tibia sul piede fisso e lascia cedere il retropiede in valgo e l’arco in pronazione, in modo che le dita “aprano” più di quanto consenta l’anca. Lo si riconosce dal calcagno evertito, dal navicolare sporgente, dal peso sul margine mediale e sull’alluce e, spesso, dalle dita che si aggrappano al pavimento (</w:t>
+      </w:r>
+      <w:r>
+        <w:rPr>
+          <w:rFonts w:ascii="Times New Roman" w:cs="Times New Roman" w:eastAsia="Times New Roman" w:hAnsi="Times New Roman"/>
+          <w:i/>
+          <w:iCs/>
+          <w:sz w:val="24"/>
+          <w:szCs w:val="24"/>
+        </w:rPr>
+        <w:t xml:space="preserve">gripping</w:t>
+      </w:r>
+      <w:r>
+        <w:rPr>
+          <w:rFonts w:ascii="Times New Roman" w:cs="Times New Roman" w:eastAsia="Times New Roman" w:hAnsi="Times New Roman"/>
+          <w:sz w:val="24"/>
+          <w:szCs w:val="24"/>
+        </w:rPr>
+        <w:t xml:space="preserve">). Il compenso al ginocchio è lo </w:t>
+      </w:r>
+      <w:r>
+        <w:rPr>
+          <w:rFonts w:ascii="Times New Roman" w:cs="Times New Roman" w:eastAsia="Times New Roman" w:hAnsi="Times New Roman"/>
+          <w:i/>
+          <w:iCs/>
+          <w:sz w:val="24"/>
+          <w:szCs w:val="24"/>
+        </w:rPr>
+        <w:t xml:space="preserve">screwing the knee</w:t>
+      </w:r>
+      <w:r>
+        <w:rPr>
+          <w:rFonts w:ascii="Times New Roman" w:cs="Times New Roman" w:eastAsia="Times New Roman" w:hAnsi="Times New Roman"/>
+          <w:sz w:val="24"/>
+          <w:szCs w:val="24"/>
+        </w:rPr>
+        <w:t xml:space="preserve">: il danzatore apre i piedi in </w:t>
+      </w:r>
+      <w:r>
+        <w:rPr>
+          <w:rFonts w:ascii="Times New Roman" w:cs="Times New Roman" w:eastAsia="Times New Roman" w:hAnsi="Times New Roman"/>
+          <w:i/>
+          <w:iCs/>
+          <w:sz w:val="24"/>
+          <w:szCs w:val="24"/>
+        </w:rPr>
+        <w:t xml:space="preserve">plié</w:t>
+      </w:r>
+      <w:r>
+        <w:rPr>
+          <w:rFonts w:ascii="Times New Roman" w:cs="Times New Roman" w:eastAsia="Times New Roman" w:hAnsi="Times New Roman"/>
+          <w:sz w:val="24"/>
+          <w:szCs w:val="24"/>
+        </w:rPr>
+        <w:t xml:space="preserve"> e poi estende le ginocchia a piedi fermi, imponendo al ginocchio una rotazione in carico che sollecita legamenti e menischi. Più in alto, l’insufficienza degli extrarotatori dell’anca e la ricerca del </w:t>
+      </w:r>
+      <w:r>
+        <w:rPr>
+          <w:rFonts w:ascii="Times New Roman" w:cs="Times New Roman" w:eastAsia="Times New Roman" w:hAnsi="Times New Roman"/>
+          <w:i/>
+          <w:iCs/>
+          <w:sz w:val="24"/>
+          <w:szCs w:val="24"/>
+        </w:rPr>
+        <w:t xml:space="preserve">turnout</w:t>
+      </w:r>
+      <w:r>
+        <w:rPr>
+          <w:rFonts w:ascii="Times New Roman" w:cs="Times New Roman" w:eastAsia="Times New Roman" w:hAnsi="Times New Roman"/>
+          <w:sz w:val="24"/>
+          <w:szCs w:val="24"/>
+        </w:rPr>
+        <w:t xml:space="preserve"> si accompagnano all’anteversione del bacino e all’iperlordosi, oppure al compenso opposto del </w:t>
+      </w:r>
+      <w:r>
+        <w:rPr>
+          <w:rFonts w:ascii="Times New Roman" w:cs="Times New Roman" w:eastAsia="Times New Roman" w:hAnsi="Times New Roman"/>
+          <w:i/>
+          <w:iCs/>
+          <w:sz w:val="24"/>
+          <w:szCs w:val="24"/>
+        </w:rPr>
+        <w:t xml:space="preserve">tucking</w:t>
+      </w:r>
+      <w:r>
+        <w:rPr>
+          <w:rFonts w:ascii="Times New Roman" w:cs="Times New Roman" w:eastAsia="Times New Roman" w:hAnsi="Times New Roman"/>
+          <w:sz w:val="24"/>
+          <w:szCs w:val="24"/>
+        </w:rPr>
+        <w:t xml:space="preserve"> (retroversione forzata), che irrigidisce il tratto lombo-pelvico.</w:t>
+      </w:r>
+      <w:r>
+        <w:rPr>
+          <w:rStyle w:val="FootnoteReference"/>
+        </w:rPr>
+        <w:footnoteReference w:id="41"/>
+      </w:r>
+      <w:r>
+        <w:rPr>
+          <w:rFonts w:ascii="Times New Roman" w:cs="Times New Roman" w:eastAsia="Times New Roman" w:hAnsi="Times New Roman"/>
+          <w:sz w:val="24"/>
+          <w:szCs w:val="24"/>
+        </w:rPr>
+        <w:t xml:space="preserve"> Altri atteggiamenti frequenti sono il </w:t>
+      </w:r>
+      <w:r>
+        <w:rPr>
+          <w:rFonts w:ascii="Times New Roman" w:cs="Times New Roman" w:eastAsia="Times New Roman" w:hAnsi="Times New Roman"/>
+          <w:i/>
+          <w:iCs/>
+          <w:sz w:val="24"/>
+          <w:szCs w:val="24"/>
+        </w:rPr>
+        <w:t xml:space="preserve">sickling</w:t>
+      </w:r>
+      <w:r>
+        <w:rPr>
+          <w:rFonts w:ascii="Times New Roman" w:cs="Times New Roman" w:eastAsia="Times New Roman" w:hAnsi="Times New Roman"/>
+          <w:sz w:val="24"/>
+          <w:szCs w:val="24"/>
+        </w:rPr>
+        <w:t xml:space="preserve"> (piede “a falce” in supinazione-adduzione, che espone i legamenti laterali), il </w:t>
+      </w:r>
+      <w:r>
+        <w:rPr>
+          <w:rFonts w:ascii="Times New Roman" w:cs="Times New Roman" w:eastAsia="Times New Roman" w:hAnsi="Times New Roman"/>
+          <w:i/>
+          <w:iCs/>
+          <w:sz w:val="24"/>
+          <w:szCs w:val="24"/>
+        </w:rPr>
+        <w:t xml:space="preserve">winging</w:t>
+      </w:r>
+      <w:r>
+        <w:rPr>
+          <w:rFonts w:ascii="Times New Roman" w:cs="Times New Roman" w:eastAsia="Times New Roman" w:hAnsi="Times New Roman"/>
+          <w:sz w:val="24"/>
+          <w:szCs w:val="24"/>
+        </w:rPr>
+        <w:t xml:space="preserve"> opposto (pronazione-abduzione, instabile), il </w:t>
+      </w:r>
+      <w:r>
+        <w:rPr>
+          <w:rFonts w:ascii="Times New Roman" w:cs="Times New Roman" w:eastAsia="Times New Roman" w:hAnsi="Times New Roman"/>
+          <w:i/>
+          <w:iCs/>
+          <w:sz w:val="24"/>
+          <w:szCs w:val="24"/>
+        </w:rPr>
+        <w:t xml:space="preserve">relevé</w:t>
+      </w:r>
+      <w:r>
+        <w:rPr>
+          <w:rFonts w:ascii="Times New Roman" w:cs="Times New Roman" w:eastAsia="Times New Roman" w:hAnsi="Times New Roman"/>
+          <w:sz w:val="24"/>
+          <w:szCs w:val="24"/>
+        </w:rPr>
+        <w:t xml:space="preserve"> con retropiede in valgo e l’asimmetria tra arto di appoggio e arto gestuale, che nel tempo produce un piede più pronato dal lato di appoggio.</w:t>
       </w:r>
     </w:p>
     <w:p>
@@ -3658,7 +4182,7 @@
       <w:r>
         <w:drawing>
           <wp:inline distT="0" distB="0" distL="0" distR="0">
-            <wp:extent cx="2162175" cy="1485900"/>
+            <wp:extent cx="2162175" cy="1504950"/>
             <wp:effectExtent t="0" r="0" b="0" l="0"/>
             <wp:docPr id="1" name="" descr="" title=""/>
             <wp:cNvGraphicFramePr>
@@ -3683,7 +4207,7 @@
                   <pic:spPr bwMode="auto">
                     <a:xfrm>
                       <a:off x="0" y="0"/>
-                      <a:ext cx="2162175" cy="1485900"/>
+                      <a:ext cx="2162175" cy="1504950"/>
                     </a:xfrm>
                     <a:prstGeom prst="rect">
                       <a:avLst/>
@@ -3709,284 +4233,7 @@
           <w:sz w:val="20"/>
           <w:szCs w:val="20"/>
         </w:rPr>
-        <w:t xml:space="preserve">Figura 9 – Il lavoro sulle punte concentra il carico su alluce, sesamoidi e flessore lungo dell’alluce.</w:t>
-      </w:r>
-    </w:p>
-    <w:p>
-      <w:pPr>
-        <w:pStyle w:val="ListParagraph"/>
-        <w:numPr>
-          <w:ilvl w:val="0"/>
-          <w:numId w:val="2"/>
-        </w:numPr>
-        <w:spacing w:after="80" w:line="360"/>
-        <w:jc w:val="both"/>
-      </w:pPr>
-      <w:r>
-        <w:rPr>
-          <w:rFonts w:ascii="Times New Roman" w:cs="Times New Roman" w:eastAsia="Times New Roman" w:hAnsi="Times New Roman"/>
-          <w:sz w:val="24"/>
-          <w:szCs w:val="24"/>
-        </w:rPr>
-        <w:t xml:space="preserve">Tendinopatia del tibiale posteriore: il muscolo lavora eccentricamente a ogni ricezione e concentricamente a ogni </w:t>
-      </w:r>
-      <w:r>
-        <w:rPr>
-          <w:rFonts w:ascii="Times New Roman" w:cs="Times New Roman" w:eastAsia="Times New Roman" w:hAnsi="Times New Roman"/>
-          <w:i/>
-          <w:iCs/>
-          <w:sz w:val="24"/>
-          <w:szCs w:val="24"/>
-        </w:rPr>
-        <w:t xml:space="preserve">relevé</w:t>
-      </w:r>
-      <w:r>
-        <w:rPr>
-          <w:rFonts w:ascii="Times New Roman" w:cs="Times New Roman" w:eastAsia="Times New Roman" w:hAnsi="Times New Roman"/>
-          <w:sz w:val="24"/>
-          <w:szCs w:val="24"/>
-        </w:rPr>
-        <w:t xml:space="preserve"> per riportare il retropiede in neutro, e nel piede pronato la richiesta è maggiore. Il dolore è retromalleolare mediale e sul navicolare, aumenta con il </w:t>
-      </w:r>
-      <w:r>
-        <w:rPr>
-          <w:rFonts w:ascii="Times New Roman" w:cs="Times New Roman" w:eastAsia="Times New Roman" w:hAnsi="Times New Roman"/>
-          <w:i/>
-          <w:iCs/>
-          <w:sz w:val="24"/>
-          <w:szCs w:val="24"/>
-        </w:rPr>
-        <w:t xml:space="preserve">relevé</w:t>
-      </w:r>
-      <w:r>
-        <w:rPr>
-          <w:rFonts w:ascii="Times New Roman" w:cs="Times New Roman" w:eastAsia="Times New Roman" w:hAnsi="Times New Roman"/>
-          <w:sz w:val="24"/>
-          <w:szCs w:val="24"/>
-        </w:rPr>
-        <w:t xml:space="preserve"> monopodalico e può evolvere verso la disfunzione descritta nel paragrafo 1.3.2.</w:t>
-      </w:r>
-    </w:p>
-    <w:p>
-      <w:pPr>
-        <w:pStyle w:val="ListParagraph"/>
-        <w:numPr>
-          <w:ilvl w:val="0"/>
-          <w:numId w:val="2"/>
-        </w:numPr>
-        <w:spacing w:after="80" w:line="360"/>
-        <w:jc w:val="both"/>
-      </w:pPr>
-      <w:r>
-        <w:rPr>
-          <w:rFonts w:ascii="Times New Roman" w:cs="Times New Roman" w:eastAsia="Times New Roman" w:hAnsi="Times New Roman"/>
-          <w:sz w:val="24"/>
-          <w:szCs w:val="24"/>
-        </w:rPr>
-        <w:t xml:space="preserve">Tendinopatia del flessore lungo dell’alluce (“tendinite del danzatore”): il tendine scorre in un tunnel osteofibroso dietro l’astragalo e sotto il sustentaculum tali; la flessione plantare estrema delle punte e la pronazione, che angola il tendine, provocano attrito, infiammazione della guaina e talvolta un nodulo con scatto (alluce a scatto). Il dolore è postero-mediale, provocato dalla flessione dell’alluce contro resistenza.</w:t>
-      </w:r>
-      <w:r>
-        <w:rPr>
-          <w:rStyle w:val="FootnoteReference"/>
-        </w:rPr>
-        <w:footnoteReference w:id="38"/>
-      </w:r>
-    </w:p>
-    <w:p>
-      <w:pPr>
-        <w:pStyle w:val="ListParagraph"/>
-        <w:numPr>
-          <w:ilvl w:val="0"/>
-          <w:numId w:val="2"/>
-        </w:numPr>
-        <w:spacing w:after="80" w:line="360"/>
-        <w:jc w:val="both"/>
-      </w:pPr>
-      <w:r>
-        <w:rPr>
-          <w:rFonts w:ascii="Times New Roman" w:cs="Times New Roman" w:eastAsia="Times New Roman" w:hAnsi="Times New Roman"/>
-          <w:sz w:val="24"/>
-          <w:szCs w:val="24"/>
-        </w:rPr>
-        <w:t xml:space="preserve">Conflitto posteriore della caviglia e </w:t>
-      </w:r>
-      <w:r>
-        <w:rPr>
-          <w:rFonts w:ascii="Times New Roman" w:cs="Times New Roman" w:eastAsia="Times New Roman" w:hAnsi="Times New Roman"/>
-          <w:i/>
-          <w:iCs/>
-          <w:sz w:val="24"/>
-          <w:szCs w:val="24"/>
-        </w:rPr>
-        <w:t xml:space="preserve">os trigonum</w:t>
-      </w:r>
-      <w:r>
-        <w:rPr>
-          <w:rFonts w:ascii="Times New Roman" w:cs="Times New Roman" w:eastAsia="Times New Roman" w:hAnsi="Times New Roman"/>
-          <w:sz w:val="24"/>
-          <w:szCs w:val="24"/>
-        </w:rPr>
-        <w:t xml:space="preserve">: la flessione plantare estrema schiaccia i tessuti posteriori tra tibia e calcagno; un </w:t>
-      </w:r>
-      <w:r>
-        <w:rPr>
-          <w:rFonts w:ascii="Times New Roman" w:cs="Times New Roman" w:eastAsia="Times New Roman" w:hAnsi="Times New Roman"/>
-          <w:i/>
-          <w:iCs/>
-          <w:sz w:val="24"/>
-          <w:szCs w:val="24"/>
-        </w:rPr>
-        <w:t xml:space="preserve">os trigonum</w:t>
-      </w:r>
-      <w:r>
-        <w:rPr>
-          <w:rFonts w:ascii="Times New Roman" w:cs="Times New Roman" w:eastAsia="Times New Roman" w:hAnsi="Times New Roman"/>
-          <w:sz w:val="24"/>
-          <w:szCs w:val="24"/>
-        </w:rPr>
-        <w:t xml:space="preserve"> (presente in circa il 10% della popolazione) o un processo posteriore dell’astragalo prominente provocano dolore posteriore nel </w:t>
-      </w:r>
-      <w:r>
-        <w:rPr>
-          <w:rFonts w:ascii="Times New Roman" w:cs="Times New Roman" w:eastAsia="Times New Roman" w:hAnsi="Times New Roman"/>
-          <w:i/>
-          <w:iCs/>
-          <w:sz w:val="24"/>
-          <w:szCs w:val="24"/>
-        </w:rPr>
-        <w:t xml:space="preserve">relevé</w:t>
-      </w:r>
-      <w:r>
-        <w:rPr>
-          <w:rFonts w:ascii="Times New Roman" w:cs="Times New Roman" w:eastAsia="Times New Roman" w:hAnsi="Times New Roman"/>
-          <w:sz w:val="24"/>
-          <w:szCs w:val="24"/>
-        </w:rPr>
-        <w:t xml:space="preserve"> e sulle punte, mentre il conflitto anteriore limita e rende doloroso il </w:t>
-      </w:r>
-      <w:r>
-        <w:rPr>
-          <w:rFonts w:ascii="Times New Roman" w:cs="Times New Roman" w:eastAsia="Times New Roman" w:hAnsi="Times New Roman"/>
-          <w:i/>
-          <w:iCs/>
-          <w:sz w:val="24"/>
-          <w:szCs w:val="24"/>
-        </w:rPr>
-        <w:t xml:space="preserve">plié</w:t>
-      </w:r>
-      <w:r>
-        <w:rPr>
-          <w:rFonts w:ascii="Times New Roman" w:cs="Times New Roman" w:eastAsia="Times New Roman" w:hAnsi="Times New Roman"/>
-          <w:sz w:val="24"/>
-          <w:szCs w:val="24"/>
-        </w:rPr>
-        <w:t xml:space="preserve">.</w:t>
-      </w:r>
-      <w:r>
-        <w:rPr>
-          <w:rStyle w:val="FootnoteReference"/>
-        </w:rPr>
-        <w:footnoteReference w:id="39"/>
-      </w:r>
-    </w:p>
-    <w:p>
-      <w:pPr>
-        <w:pStyle w:val="ListParagraph"/>
-        <w:numPr>
-          <w:ilvl w:val="0"/>
-          <w:numId w:val="2"/>
-        </w:numPr>
-        <w:spacing w:after="80" w:line="360"/>
-        <w:jc w:val="both"/>
-      </w:pPr>
-      <w:r>
-        <w:rPr>
-          <w:rFonts w:ascii="Times New Roman" w:cs="Times New Roman" w:eastAsia="Times New Roman" w:hAnsi="Times New Roman"/>
-          <w:sz w:val="24"/>
-          <w:szCs w:val="24"/>
-        </w:rPr>
-        <w:t xml:space="preserve">Alluce valgo, alluce rigido e sesamoiditi: la pronazione sposta il carico sul margine mediale dell’avampiede e favorisce la deviazione dell’alluce; punte e mezza punta sovraccaricano i sesamoidi e la prima metatarso-falangea, limitando l’estensione necessaria al </w:t>
-      </w:r>
-      <w:r>
-        <w:rPr>
-          <w:rFonts w:ascii="Times New Roman" w:cs="Times New Roman" w:eastAsia="Times New Roman" w:hAnsi="Times New Roman"/>
-          <w:i/>
-          <w:iCs/>
-          <w:sz w:val="24"/>
-          <w:szCs w:val="24"/>
-        </w:rPr>
-        <w:t xml:space="preserve">relevé</w:t>
-      </w:r>
-      <w:r>
-        <w:rPr>
-          <w:rFonts w:ascii="Times New Roman" w:cs="Times New Roman" w:eastAsia="Times New Roman" w:hAnsi="Times New Roman"/>
-          <w:sz w:val="24"/>
-          <w:szCs w:val="24"/>
-        </w:rPr>
-        <w:t xml:space="preserve">.</w:t>
-      </w:r>
-    </w:p>
-    <w:p>
-      <w:pPr>
-        <w:pStyle w:val="ListParagraph"/>
-        <w:numPr>
-          <w:ilvl w:val="0"/>
-          <w:numId w:val="2"/>
-        </w:numPr>
-        <w:spacing w:after="80" w:line="360"/>
-        <w:jc w:val="both"/>
-      </w:pPr>
-      <w:r>
-        <w:rPr>
-          <w:rFonts w:ascii="Times New Roman" w:cs="Times New Roman" w:eastAsia="Times New Roman" w:hAnsi="Times New Roman"/>
-          <w:sz w:val="24"/>
-          <w:szCs w:val="24"/>
-        </w:rPr>
-        <w:t xml:space="preserve">Fratture da stress: il secondo metatarso, soprattutto alla base, è la sede classica nel danzatore sulle punte, perché il piede pronato con primo raggio ipermobile trasferisce il carico sul secondo raggio; sono descritte anche fratture del navicolare e della tibia distale. Il dolore che aumenta con il carico e persiste a riposo richiede un invio immediato.</w:t>
-      </w:r>
-      <w:r>
-        <w:rPr>
-          <w:rStyle w:val="FootnoteReference"/>
-        </w:rPr>
-        <w:footnoteReference w:id="40"/>
-      </w:r>
-    </w:p>
-    <w:p>
-      <w:pPr>
-        <w:pStyle w:val="ListParagraph"/>
-        <w:numPr>
-          <w:ilvl w:val="0"/>
-          <w:numId w:val="2"/>
-        </w:numPr>
-        <w:spacing w:after="80" w:line="360"/>
-        <w:jc w:val="both"/>
-      </w:pPr>
-      <w:r>
-        <w:rPr>
-          <w:rFonts w:ascii="Times New Roman" w:cs="Times New Roman" w:eastAsia="Times New Roman" w:hAnsi="Times New Roman"/>
-          <w:sz w:val="24"/>
-          <w:szCs w:val="24"/>
-        </w:rPr>
-        <w:t xml:space="preserve">Fascite plantare, tendinopatia d’Achille e sindrome da stress tibiale mediale, legate alla pronazione prolungata e al sovraccarico eccentrico della catena posteriore (paragrafo 1.3.4).</w:t>
-      </w:r>
-    </w:p>
-    <w:p>
-      <w:pPr>
-        <w:pStyle w:val="ListParagraph"/>
-        <w:numPr>
-          <w:ilvl w:val="0"/>
-          <w:numId w:val="2"/>
-        </w:numPr>
-        <w:spacing w:after="80" w:line="360"/>
-        <w:jc w:val="both"/>
-      </w:pPr>
-      <w:r>
-        <w:rPr>
-          <w:rFonts w:ascii="Times New Roman" w:cs="Times New Roman" w:eastAsia="Times New Roman" w:hAnsi="Times New Roman"/>
-          <w:sz w:val="24"/>
-          <w:szCs w:val="24"/>
-        </w:rPr>
-        <w:t xml:space="preserve">Distorsioni laterali e instabilità cronica della caviglia: frequenti nelle ricezioni in flessione plantare, con il legamento peroneo-astragalico anteriore come struttura più coinvolta; le distorsioni ripetute peggiorano l’afferenza propriocettiva e il controllo del retropiede. Vi si associa spesso la sindrome del cuboide, irritazione della calcaneo-cuboidea per trazione del peroneo lungo, con dolore laterale del mesopiede.</w:t>
+        <w:t xml:space="preserve">Figura 9 – Allineamento di ginocchio e piede in prima posizione: il “rolling in” del piede pronato.</w:t>
       </w:r>
     </w:p>
     <w:p>
@@ -4006,7 +4253,7 @@
           <w:sz w:val="24"/>
           <w:szCs w:val="24"/>
         </w:rPr>
-        <w:t xml:space="preserve">1.4.3 Problematiche posturali</w:t>
+        <w:t xml:space="preserve">1.4.4 Problematiche funzionali</w:t>
       </w:r>
     </w:p>
     <w:p>
@@ -4020,7 +4267,149 @@
           <w:sz w:val="24"/>
           <w:szCs w:val="24"/>
         </w:rPr>
-        <w:t xml:space="preserve">Sul piano posturale il quadro più caratteristico è il </w:t>
+        <w:t xml:space="preserve">Sul piano funzionale la limitazione più rilevante è la ridotta dorsiflessione della caviglia, legata alla retrazione del tricipite surale e, talvolta, a un conflitto anteriore: il </w:t>
+      </w:r>
+      <w:r>
+        <w:rPr>
+          <w:rFonts w:ascii="Times New Roman" w:cs="Times New Roman" w:eastAsia="Times New Roman" w:hAnsi="Times New Roman"/>
+          <w:i/>
+          <w:iCs/>
+          <w:sz w:val="24"/>
+          <w:szCs w:val="24"/>
+        </w:rPr>
+        <w:t xml:space="preserve">plié</w:t>
+      </w:r>
+      <w:r>
+        <w:rPr>
+          <w:rFonts w:ascii="Times New Roman" w:cs="Times New Roman" w:eastAsia="Times New Roman" w:hAnsi="Times New Roman"/>
+          <w:sz w:val="24"/>
+          <w:szCs w:val="24"/>
+        </w:rPr>
+        <w:t xml:space="preserve"> diventa poco profondo, il tallone tende a sollevarsi e il danzatore ricava l’ampiezza mancante pronando il piede e avvicinando le ginocchia, con tutte le conseguenze descritte sulla catena. La seconda è la debolezza degli intrinseci e del tibiale posteriore, che si manifesta con un </w:t>
+      </w:r>
+      <w:r>
+        <w:rPr>
+          <w:rFonts w:ascii="Times New Roman" w:cs="Times New Roman" w:eastAsia="Times New Roman" w:hAnsi="Times New Roman"/>
+          <w:i/>
+          <w:iCs/>
+          <w:sz w:val="24"/>
+          <w:szCs w:val="24"/>
+        </w:rPr>
+        <w:t xml:space="preserve">relevé</w:t>
+      </w:r>
+      <w:r>
+        <w:rPr>
+          <w:rFonts w:ascii="Times New Roman" w:cs="Times New Roman" w:eastAsia="Times New Roman" w:hAnsi="Times New Roman"/>
+          <w:sz w:val="24"/>
+          <w:szCs w:val="24"/>
+        </w:rPr>
+        <w:t xml:space="preserve"> instabile, fatica precoce del polpaccio e crampi plantari; nel piede pronato, inoltre, il meccanismo </w:t>
+      </w:r>
+      <w:r>
+        <w:rPr>
+          <w:rFonts w:ascii="Times New Roman" w:cs="Times New Roman" w:eastAsia="Times New Roman" w:hAnsi="Times New Roman"/>
+          <w:i/>
+          <w:iCs/>
+          <w:sz w:val="24"/>
+          <w:szCs w:val="24"/>
+        </w:rPr>
+        <w:t xml:space="preserve">windlass</w:t>
+      </w:r>
+      <w:r>
+        <w:rPr>
+          <w:rFonts w:ascii="Times New Roman" w:cs="Times New Roman" w:eastAsia="Times New Roman" w:hAnsi="Times New Roman"/>
+          <w:sz w:val="24"/>
+          <w:szCs w:val="24"/>
+        </w:rPr>
+        <w:t xml:space="preserve"> è meno efficiente e l’arco non si innalza adeguatamente in spinta e in mezza punta. La terza è il deficit di controllo neuromuscolare e di equilibrio monopodalico, legato all’alterazione dell’afferenza propriocettiva, che compromette </w:t>
+      </w:r>
+      <w:r>
+        <w:rPr>
+          <w:rFonts w:ascii="Times New Roman" w:cs="Times New Roman" w:eastAsia="Times New Roman" w:hAnsi="Times New Roman"/>
+          <w:i/>
+          <w:iCs/>
+          <w:sz w:val="24"/>
+          <w:szCs w:val="24"/>
+        </w:rPr>
+        <w:t xml:space="preserve">pirouette</w:t>
+      </w:r>
+      <w:r>
+        <w:rPr>
+          <w:rFonts w:ascii="Times New Roman" w:cs="Times New Roman" w:eastAsia="Times New Roman" w:hAnsi="Times New Roman"/>
+          <w:sz w:val="24"/>
+          <w:szCs w:val="24"/>
+        </w:rPr>
+        <w:t xml:space="preserve">, </w:t>
+      </w:r>
+      <w:r>
+        <w:rPr>
+          <w:rFonts w:ascii="Times New Roman" w:cs="Times New Roman" w:eastAsia="Times New Roman" w:hAnsi="Times New Roman"/>
+          <w:i/>
+          <w:iCs/>
+          <w:sz w:val="24"/>
+          <w:szCs w:val="24"/>
+        </w:rPr>
+        <w:t xml:space="preserve">adagio</w:t>
+      </w:r>
+      <w:r>
+        <w:rPr>
+          <w:rFonts w:ascii="Times New Roman" w:cs="Times New Roman" w:eastAsia="Times New Roman" w:hAnsi="Times New Roman"/>
+          <w:sz w:val="24"/>
+          <w:szCs w:val="24"/>
+        </w:rPr>
+        <w:t xml:space="preserve"> e ricezioni. Si aggiungono la gestione del carico (lezioni, prove, punte introdotte prima della maturazione), le scarpette, il pavimento e la fatica, che riduce la protezione muscolare delle strutture passive.</w:t>
+      </w:r>
+      <w:r>
+        <w:rPr>
+          <w:rStyle w:val="FootnoteReference"/>
+        </w:rPr>
+        <w:footnoteReference w:id="42"/>
+      </w:r>
+    </w:p>
+    <w:p>
+      <w:pPr>
+        <w:spacing w:after="120" w:line="360"/>
+        <w:jc w:val="both"/>
+      </w:pPr>
+      <w:r>
+        <w:rPr>
+          <w:rFonts w:ascii="Times New Roman" w:cs="Times New Roman" w:eastAsia="Times New Roman" w:hAnsi="Times New Roman"/>
+          <w:sz w:val="24"/>
+          <w:szCs w:val="24"/>
+        </w:rPr>
+        <w:t xml:space="preserve">Va ricordato il versante positivo: la danza classica, con tecnica corretta e progressione adeguata, allena proprio le qualità di cui il piede pronato ha bisogno (forza di intrinseci e tibiale posteriore, controllo del retropiede, equilibrio). Non è però una terapia del piede piatto: l’obiettivo non è eliminare la pronazione, ma renderla controllata e compensata.</w:t>
+      </w:r>
+    </w:p>
+    <w:p>
+      <w:pPr>
+        <w:pStyle w:val="Heading1"/>
+        <w:pageBreakBefore/>
+        <w:spacing w:after="240" w:before="0" w:line="360"/>
+      </w:pPr>
+      <w:r>
+        <w:rPr>
+          <w:rFonts w:ascii="Times New Roman" w:cs="Times New Roman" w:eastAsia="Times New Roman" w:hAnsi="Times New Roman"/>
+          <w:b/>
+          <w:bCs/>
+          <w:color w:val="000000"/>
+          <w:sz w:val="28"/>
+          <w:szCs w:val="28"/>
+        </w:rPr>
+        <w:t xml:space="preserve">CAPITOLO 2 – DESCRIZIONE PRATICA DELL’ARGOMENTO</w:t>
+      </w:r>
+    </w:p>
+    <w:p>
+      <w:pPr>
+        <w:spacing w:after="120" w:line="360"/>
+        <w:jc w:val="both"/>
+      </w:pPr>
+      <w:r>
+        <w:rPr>
+          <w:rFonts w:ascii="Times New Roman" w:cs="Times New Roman" w:eastAsia="Times New Roman" w:hAnsi="Times New Roman"/>
+          <w:sz w:val="24"/>
+          <w:szCs w:val="24"/>
+        </w:rPr>
+        <w:t xml:space="preserve">Il capitolo descrive un caso didattico costruito sulle osservazioni raccolte durante il tirocinio. Il soggetto è una studentessa di danza classica di 19 anni, con dodici anni di pratica, cinque lezioni settimanali di un’ora e mezza, due delle quali sulle punte. Presenta un piede piatto flessibile bilaterale, con arco visibile da seduta e in sollevamento sul tallone e scomparsa in carico, valgismo del calcagno più marcato a destra (arto di appoggio abituale), navicolare sporgente, segno delle “troppe dita” positivo a destra, </w:t>
       </w:r>
       <w:r>
         <w:rPr>
@@ -4038,7 +4427,21 @@
           <w:sz w:val="24"/>
           <w:szCs w:val="24"/>
         </w:rPr>
-        <w:t xml:space="preserve">: il danzatore, per raggiungere il </w:t>
+        <w:t xml:space="preserve"> in prima posizione e dorsiflessione limitata a ginocchio esteso. Riferisce tensione del polpaccio e della regione retromalleolare mediale destra dopo le lezioni e nei giorni di punte, crampi plantari serali e tensione dell’alluce destro; nessun dolore notturno, trauma o gonfiore. Il sollevamento monopodalico del tallone è possibile con buona inversione del calcagno; il test di Jack innalza l’arco.</w:t>
+      </w:r>
+    </w:p>
+    <w:p>
+      <w:pPr>
+        <w:spacing w:after="120" w:line="360"/>
+        <w:jc w:val="both"/>
+      </w:pPr>
+      <w:r>
+        <w:rPr>
+          <w:rFonts w:ascii="Times New Roman" w:cs="Times New Roman" w:eastAsia="Times New Roman" w:hAnsi="Times New Roman"/>
+          <w:sz w:val="24"/>
+          <w:szCs w:val="24"/>
+        </w:rPr>
+        <w:t xml:space="preserve">Il quadro è compatibile con un sovraccarico funzionale delle strutture che compensano la pronazione (tibiale posteriore, tricipite surale, flessore lungo dell’alluce, intrinseci) in un piede piatto flessibile. In assenza di segni di allarme (dolore a riposo, gonfiore, trauma, incapacità di carico, deficit del sollevamento monopodalico) la situazione rientra nelle competenze dell’operatore MCB; è stato comunque consigliato un controllo del medico sportivo e del fisioterapista della scuola. Gli obiettivi concordati sono la riduzione di tensioni e affaticamento, il miglioramento della mobilità di caviglia e mesopiede, il recupero tra le lezioni e il supporto a un programma di esercizio attivo per il controllo dell’appoggio e del </w:t>
       </w:r>
       <w:r>
         <w:rPr>
@@ -4056,165 +4459,39 @@
           <w:sz w:val="24"/>
           <w:szCs w:val="24"/>
         </w:rPr>
-        <w:t xml:space="preserve"> richiesto, ruota esternamente la tibia sul piede fisso e lascia cedere il retropiede in valgo e l’arco in pronazione, in modo che le dita “aprano” più di quanto consenta l’anca. Lo si riconosce dal calcagno evertito, dal navicolare sporgente, dal peso sul margine mediale e sull’alluce e, spesso, dalle dita che si aggrappano al pavimento (</w:t>
-      </w:r>
-      <w:r>
-        <w:rPr>
-          <w:rFonts w:ascii="Times New Roman" w:cs="Times New Roman" w:eastAsia="Times New Roman" w:hAnsi="Times New Roman"/>
-          <w:i/>
-          <w:iCs/>
-          <w:sz w:val="24"/>
-          <w:szCs w:val="24"/>
-        </w:rPr>
-        <w:t xml:space="preserve">gripping</w:t>
-      </w:r>
-      <w:r>
-        <w:rPr>
-          <w:rFonts w:ascii="Times New Roman" w:cs="Times New Roman" w:eastAsia="Times New Roman" w:hAnsi="Times New Roman"/>
-          <w:sz w:val="24"/>
-          <w:szCs w:val="24"/>
-        </w:rPr>
-        <w:t xml:space="preserve">). Il compenso al ginocchio è lo </w:t>
-      </w:r>
-      <w:r>
-        <w:rPr>
-          <w:rFonts w:ascii="Times New Roman" w:cs="Times New Roman" w:eastAsia="Times New Roman" w:hAnsi="Times New Roman"/>
-          <w:i/>
-          <w:iCs/>
-          <w:sz w:val="24"/>
-          <w:szCs w:val="24"/>
-        </w:rPr>
-        <w:t xml:space="preserve">screwing the knee</w:t>
-      </w:r>
-      <w:r>
-        <w:rPr>
-          <w:rFonts w:ascii="Times New Roman" w:cs="Times New Roman" w:eastAsia="Times New Roman" w:hAnsi="Times New Roman"/>
-          <w:sz w:val="24"/>
-          <w:szCs w:val="24"/>
-        </w:rPr>
-        <w:t xml:space="preserve">: il danzatore apre i piedi in </w:t>
-      </w:r>
-      <w:r>
-        <w:rPr>
-          <w:rFonts w:ascii="Times New Roman" w:cs="Times New Roman" w:eastAsia="Times New Roman" w:hAnsi="Times New Roman"/>
-          <w:i/>
-          <w:iCs/>
-          <w:sz w:val="24"/>
-          <w:szCs w:val="24"/>
-        </w:rPr>
-        <w:t xml:space="preserve">plié</w:t>
-      </w:r>
-      <w:r>
-        <w:rPr>
-          <w:rFonts w:ascii="Times New Roman" w:cs="Times New Roman" w:eastAsia="Times New Roman" w:hAnsi="Times New Roman"/>
-          <w:sz w:val="24"/>
-          <w:szCs w:val="24"/>
-        </w:rPr>
-        <w:t xml:space="preserve"> e poi estende le ginocchia a piedi fermi, imponendo al ginocchio una rotazione in carico che sollecita legamenti e menischi. Più in alto, l’insufficienza degli extrarotatori dell’anca e la ricerca del </w:t>
-      </w:r>
-      <w:r>
-        <w:rPr>
-          <w:rFonts w:ascii="Times New Roman" w:cs="Times New Roman" w:eastAsia="Times New Roman" w:hAnsi="Times New Roman"/>
-          <w:i/>
-          <w:iCs/>
-          <w:sz w:val="24"/>
-          <w:szCs w:val="24"/>
-        </w:rPr>
-        <w:t xml:space="preserve">turnout</w:t>
-      </w:r>
-      <w:r>
-        <w:rPr>
-          <w:rFonts w:ascii="Times New Roman" w:cs="Times New Roman" w:eastAsia="Times New Roman" w:hAnsi="Times New Roman"/>
-          <w:sz w:val="24"/>
-          <w:szCs w:val="24"/>
-        </w:rPr>
-        <w:t xml:space="preserve"> si accompagnano all’anteversione del bacino e all’iperlordosi, oppure al compenso opposto del </w:t>
-      </w:r>
-      <w:r>
-        <w:rPr>
-          <w:rFonts w:ascii="Times New Roman" w:cs="Times New Roman" w:eastAsia="Times New Roman" w:hAnsi="Times New Roman"/>
-          <w:i/>
-          <w:iCs/>
-          <w:sz w:val="24"/>
-          <w:szCs w:val="24"/>
-        </w:rPr>
-        <w:t xml:space="preserve">tucking</w:t>
-      </w:r>
-      <w:r>
-        <w:rPr>
-          <w:rFonts w:ascii="Times New Roman" w:cs="Times New Roman" w:eastAsia="Times New Roman" w:hAnsi="Times New Roman"/>
-          <w:sz w:val="24"/>
-          <w:szCs w:val="24"/>
-        </w:rPr>
-        <w:t xml:space="preserve"> (retroversione forzata), che irrigidisce il tratto lombo-pelvico.</w:t>
-      </w:r>
-      <w:r>
-        <w:rPr>
-          <w:rStyle w:val="FootnoteReference"/>
-        </w:rPr>
-        <w:footnoteReference w:id="41"/>
-      </w:r>
-      <w:r>
-        <w:rPr>
-          <w:rFonts w:ascii="Times New Roman" w:cs="Times New Roman" w:eastAsia="Times New Roman" w:hAnsi="Times New Roman"/>
-          <w:sz w:val="24"/>
-          <w:szCs w:val="24"/>
-        </w:rPr>
-        <w:t xml:space="preserve"> Altri atteggiamenti frequenti sono il </w:t>
-      </w:r>
-      <w:r>
-        <w:rPr>
-          <w:rFonts w:ascii="Times New Roman" w:cs="Times New Roman" w:eastAsia="Times New Roman" w:hAnsi="Times New Roman"/>
-          <w:i/>
-          <w:iCs/>
-          <w:sz w:val="24"/>
-          <w:szCs w:val="24"/>
-        </w:rPr>
-        <w:t xml:space="preserve">sickling</w:t>
-      </w:r>
-      <w:r>
-        <w:rPr>
-          <w:rFonts w:ascii="Times New Roman" w:cs="Times New Roman" w:eastAsia="Times New Roman" w:hAnsi="Times New Roman"/>
-          <w:sz w:val="24"/>
-          <w:szCs w:val="24"/>
-        </w:rPr>
-        <w:t xml:space="preserve"> (piede “a falce”, deviato in supinazione-adduzione sulle punte, che espone i legamenti laterali), il </w:t>
-      </w:r>
-      <w:r>
-        <w:rPr>
-          <w:rFonts w:ascii="Times New Roman" w:cs="Times New Roman" w:eastAsia="Times New Roman" w:hAnsi="Times New Roman"/>
-          <w:i/>
-          <w:iCs/>
-          <w:sz w:val="24"/>
-          <w:szCs w:val="24"/>
-        </w:rPr>
-        <w:t xml:space="preserve">winging</w:t>
-      </w:r>
-      <w:r>
-        <w:rPr>
-          <w:rFonts w:ascii="Times New Roman" w:cs="Times New Roman" w:eastAsia="Times New Roman" w:hAnsi="Times New Roman"/>
-          <w:sz w:val="24"/>
-          <w:szCs w:val="24"/>
-        </w:rPr>
-        <w:t xml:space="preserve"> opposto (pronazione-abduzione, esteticamente ricercato ma instabile), il </w:t>
-      </w:r>
-      <w:r>
-        <w:rPr>
-          <w:rFonts w:ascii="Times New Roman" w:cs="Times New Roman" w:eastAsia="Times New Roman" w:hAnsi="Times New Roman"/>
-          <w:i/>
-          <w:iCs/>
-          <w:sz w:val="24"/>
-          <w:szCs w:val="24"/>
-        </w:rPr>
-        <w:t xml:space="preserve">relevé</w:t>
-      </w:r>
-      <w:r>
-        <w:rPr>
-          <w:rFonts w:ascii="Times New Roman" w:cs="Times New Roman" w:eastAsia="Times New Roman" w:hAnsi="Times New Roman"/>
-          <w:sz w:val="24"/>
-          <w:szCs w:val="24"/>
-        </w:rPr>
-        <w:t xml:space="preserve"> con retropiede in valgo e carico su alluce e secondo dito, la mezza punta “bassa” per limitata estensione della prima metatarso-falangea e l’asimmetria tra arto di appoggio abituale e arto gestuale, che nel tempo produce un piede più pronato dal lato di appoggio.</w:t>
+        <w:t xml:space="preserve">.</w:t>
+      </w:r>
+    </w:p>
+    <w:p>
+      <w:pPr>
+        <w:pStyle w:val="Heading2"/>
+        <w:keepNext/>
+        <w:spacing w:after="120" w:before="240" w:line="360"/>
+      </w:pPr>
+      <w:r>
+        <w:rPr>
+          <w:rFonts w:ascii="Times New Roman" w:cs="Times New Roman" w:eastAsia="Times New Roman" w:hAnsi="Times New Roman"/>
+          <w:b/>
+          <w:bCs/>
+          <w:color w:val="000000"/>
+          <w:sz w:val="24"/>
+          <w:szCs w:val="24"/>
+        </w:rPr>
+        <w:t xml:space="preserve">2.1 Descrizione del protocollo/trattamento massoterapico</w:t>
+      </w:r>
+    </w:p>
+    <w:p>
+      <w:pPr>
+        <w:spacing w:after="120" w:line="360"/>
+        <w:jc w:val="both"/>
+      </w:pPr>
+      <w:r>
+        <w:rPr>
+          <w:rFonts w:ascii="Times New Roman" w:cs="Times New Roman" w:eastAsia="Times New Roman" w:hAnsi="Times New Roman"/>
+          <w:sz w:val="24"/>
+          <w:szCs w:val="24"/>
+        </w:rPr>
+        <w:t xml:space="preserve">Il trattamento è programmato con cadenza settimanale per sei settimane, della durata di circa 50 minuti, nel giorno più leggero della settimana o dopo il lavoro sulle punte, con funzione di recupero. Ogni seduta inizia con un breve colloquio su sintomi, carico e tolleranza del trattamento precedente e con l’osservazione dell’appoggio e del sollevamento sul tallone. Le pressioni sono modulate sulla tolleranza della persona; il massaggio non viene eseguito in presenza di flogosi acuta, sospetta lesione tendinea o frattura da stress, patologie vascolari, infezioni o lesioni cutanee. Il mezzo di scorrimento è un olio neutro in quantità moderata.</w:t>
       </w:r>
     </w:p>
     <w:p>
@@ -4226,7 +4503,7 @@
       <w:r>
         <w:drawing>
           <wp:inline distT="0" distB="0" distL="0" distR="0">
-            <wp:extent cx="2162175" cy="1504950"/>
+            <wp:extent cx="1800225" cy="1085850"/>
             <wp:effectExtent t="0" r="0" b="0" l="0"/>
             <wp:docPr id="1" name="" descr="" title=""/>
             <wp:cNvGraphicFramePr>
@@ -4251,345 +4528,6 @@
                   <pic:spPr bwMode="auto">
                     <a:xfrm>
                       <a:off x="0" y="0"/>
-                      <a:ext cx="2162175" cy="1504950"/>
-                    </a:xfrm>
-                    <a:prstGeom prst="rect">
-                      <a:avLst/>
-                    </a:prstGeom>
-                  </pic:spPr>
-                </pic:pic>
-              </a:graphicData>
-            </a:graphic>
-          </wp:inline>
-        </w:drawing>
-      </w:r>
-    </w:p>
-    <w:p>
-      <w:pPr>
-        <w:spacing w:after="200" w:line="276"/>
-        <w:jc w:val="center"/>
-      </w:pPr>
-      <w:r>
-        <w:rPr>
-          <w:rFonts w:ascii="Times New Roman" w:cs="Times New Roman" w:eastAsia="Times New Roman" w:hAnsi="Times New Roman"/>
-          <w:i/>
-          <w:iCs/>
-          <w:sz w:val="20"/>
-          <w:szCs w:val="20"/>
-        </w:rPr>
-        <w:t xml:space="preserve">Figura 10 – Allineamento di ginocchio e piede in prima posizione: il “rolling in” del piede pronato.</w:t>
-      </w:r>
-    </w:p>
-    <w:p>
-      <w:pPr>
-        <w:pStyle w:val="Heading3"/>
-        <w:keepNext/>
-        <w:spacing w:after="100" w:before="180" w:line="360"/>
-      </w:pPr>
-      <w:r>
-        <w:rPr>
-          <w:rFonts w:ascii="Times New Roman" w:cs="Times New Roman" w:eastAsia="Times New Roman" w:hAnsi="Times New Roman"/>
-          <w:b/>
-          <w:bCs/>
-          <w:i/>
-          <w:iCs/>
-          <w:color w:val="000000"/>
-          <w:sz w:val="24"/>
-          <w:szCs w:val="24"/>
-        </w:rPr>
-        <w:t xml:space="preserve">1.4.4 Problematiche funzionali</w:t>
-      </w:r>
-    </w:p>
-    <w:p>
-      <w:pPr>
-        <w:spacing w:after="120" w:line="360"/>
-        <w:jc w:val="both"/>
-      </w:pPr>
-      <w:r>
-        <w:rPr>
-          <w:rFonts w:ascii="Times New Roman" w:cs="Times New Roman" w:eastAsia="Times New Roman" w:hAnsi="Times New Roman"/>
-          <w:sz w:val="24"/>
-          <w:szCs w:val="24"/>
-        </w:rPr>
-        <w:t xml:space="preserve">Sul piano funzionale la limitazione più rilevante è la ridotta dorsiflessione della caviglia, legata alla retrazione del tricipite surale e, talvolta, a un conflitto anteriore: il </w:t>
-      </w:r>
-      <w:r>
-        <w:rPr>
-          <w:rFonts w:ascii="Times New Roman" w:cs="Times New Roman" w:eastAsia="Times New Roman" w:hAnsi="Times New Roman"/>
-          <w:i/>
-          <w:iCs/>
-          <w:sz w:val="24"/>
-          <w:szCs w:val="24"/>
-        </w:rPr>
-        <w:t xml:space="preserve">plié</w:t>
-      </w:r>
-      <w:r>
-        <w:rPr>
-          <w:rFonts w:ascii="Times New Roman" w:cs="Times New Roman" w:eastAsia="Times New Roman" w:hAnsi="Times New Roman"/>
-          <w:sz w:val="24"/>
-          <w:szCs w:val="24"/>
-        </w:rPr>
-        <w:t xml:space="preserve"> diventa poco profondo, il tallone tende a sollevarsi e il danzatore ricava l’ampiezza mancante pronando il piede e avvicinando le ginocchia, con tutte le conseguenze descritte sulla catena. La seconda è la debolezza o la scarsa coordinazione dei muscoli intrinseci e del tibiale posteriore, che si manifesta con un </w:t>
-      </w:r>
-      <w:r>
-        <w:rPr>
-          <w:rFonts w:ascii="Times New Roman" w:cs="Times New Roman" w:eastAsia="Times New Roman" w:hAnsi="Times New Roman"/>
-          <w:i/>
-          <w:iCs/>
-          <w:sz w:val="24"/>
-          <w:szCs w:val="24"/>
-        </w:rPr>
-        <w:t xml:space="preserve">relevé</w:t>
-      </w:r>
-      <w:r>
-        <w:rPr>
-          <w:rFonts w:ascii="Times New Roman" w:cs="Times New Roman" w:eastAsia="Times New Roman" w:hAnsi="Times New Roman"/>
-          <w:sz w:val="24"/>
-          <w:szCs w:val="24"/>
-        </w:rPr>
-        <w:t xml:space="preserve"> instabile, con il retropiede che oscilla, con la fatica precoce del polpaccio e con i crampi plantari; nel piede pronato, inoltre, il meccanismo </w:t>
-      </w:r>
-      <w:r>
-        <w:rPr>
-          <w:rFonts w:ascii="Times New Roman" w:cs="Times New Roman" w:eastAsia="Times New Roman" w:hAnsi="Times New Roman"/>
-          <w:i/>
-          <w:iCs/>
-          <w:sz w:val="24"/>
-          <w:szCs w:val="24"/>
-        </w:rPr>
-        <w:t xml:space="preserve">windlass</w:t>
-      </w:r>
-      <w:r>
-        <w:rPr>
-          <w:rFonts w:ascii="Times New Roman" w:cs="Times New Roman" w:eastAsia="Times New Roman" w:hAnsi="Times New Roman"/>
-          <w:sz w:val="24"/>
-          <w:szCs w:val="24"/>
-        </w:rPr>
-        <w:t xml:space="preserve"> è meno efficiente e l’arco non si innalza adeguatamente nella spinta e in mezza punta. La terza è il deficit di controllo neuromuscolare e di equilibrio monopodalico, legato all’alterazione dell’afferenza propriocettiva, che compromette </w:t>
-      </w:r>
-      <w:r>
-        <w:rPr>
-          <w:rFonts w:ascii="Times New Roman" w:cs="Times New Roman" w:eastAsia="Times New Roman" w:hAnsi="Times New Roman"/>
-          <w:i/>
-          <w:iCs/>
-          <w:sz w:val="24"/>
-          <w:szCs w:val="24"/>
-        </w:rPr>
-        <w:t xml:space="preserve">pirouette</w:t>
-      </w:r>
-      <w:r>
-        <w:rPr>
-          <w:rFonts w:ascii="Times New Roman" w:cs="Times New Roman" w:eastAsia="Times New Roman" w:hAnsi="Times New Roman"/>
-          <w:sz w:val="24"/>
-          <w:szCs w:val="24"/>
-        </w:rPr>
-        <w:t xml:space="preserve">, </w:t>
-      </w:r>
-      <w:r>
-        <w:rPr>
-          <w:rFonts w:ascii="Times New Roman" w:cs="Times New Roman" w:eastAsia="Times New Roman" w:hAnsi="Times New Roman"/>
-          <w:i/>
-          <w:iCs/>
-          <w:sz w:val="24"/>
-          <w:szCs w:val="24"/>
-        </w:rPr>
-        <w:t xml:space="preserve">adagio</w:t>
-      </w:r>
-      <w:r>
-        <w:rPr>
-          <w:rFonts w:ascii="Times New Roman" w:cs="Times New Roman" w:eastAsia="Times New Roman" w:hAnsi="Times New Roman"/>
-          <w:sz w:val="24"/>
-          <w:szCs w:val="24"/>
-        </w:rPr>
-        <w:t xml:space="preserve"> e ricezioni. Si aggiungono la gestione del carico (lezioni, prove, introduzione delle punte prima della maturazione muscolare e ossea), le scarpette, il pavimento e la fatica, che riduce la protezione muscolare delle strutture passive.</w:t>
-      </w:r>
-      <w:r>
-        <w:rPr>
-          <w:rStyle w:val="FootnoteReference"/>
-        </w:rPr>
-        <w:footnoteReference w:id="42"/>
-      </w:r>
-    </w:p>
-    <w:p>
-      <w:pPr>
-        <w:spacing w:after="120" w:line="360"/>
-        <w:jc w:val="both"/>
-      </w:pPr>
-      <w:r>
-        <w:rPr>
-          <w:rFonts w:ascii="Times New Roman" w:cs="Times New Roman" w:eastAsia="Times New Roman" w:hAnsi="Times New Roman"/>
-          <w:sz w:val="24"/>
-          <w:szCs w:val="24"/>
-        </w:rPr>
-        <w:t xml:space="preserve">Va ricordato il versante positivo: la danza classica, con tecnica corretta e progressione adeguata, allena proprio le qualità di cui il piede pronato ha bisogno (forza di intrinseci e tibiale posteriore, controllo del retropiede in </w:t>
-      </w:r>
-      <w:r>
-        <w:rPr>
-          <w:rFonts w:ascii="Times New Roman" w:cs="Times New Roman" w:eastAsia="Times New Roman" w:hAnsi="Times New Roman"/>
-          <w:i/>
-          <w:iCs/>
-          <w:sz w:val="24"/>
-          <w:szCs w:val="24"/>
-        </w:rPr>
-        <w:t xml:space="preserve">relevé</w:t>
-      </w:r>
-      <w:r>
-        <w:rPr>
-          <w:rFonts w:ascii="Times New Roman" w:cs="Times New Roman" w:eastAsia="Times New Roman" w:hAnsi="Times New Roman"/>
-          <w:sz w:val="24"/>
-          <w:szCs w:val="24"/>
-        </w:rPr>
-        <w:t xml:space="preserve">, equilibrio, consapevolezza dell’allineamento). Non è però una terapia del piede piatto: l’obiettivo non è eliminare la pronazione, ma renderla controllata e compensata da stabilizzatori efficienti.</w:t>
-      </w:r>
-    </w:p>
-    <w:p>
-      <w:pPr>
-        <w:pStyle w:val="Heading1"/>
-        <w:pageBreakBefore/>
-        <w:spacing w:after="240" w:before="0" w:line="360"/>
-      </w:pPr>
-      <w:r>
-        <w:rPr>
-          <w:rFonts w:ascii="Times New Roman" w:cs="Times New Roman" w:eastAsia="Times New Roman" w:hAnsi="Times New Roman"/>
-          <w:b/>
-          <w:bCs/>
-          <w:color w:val="000000"/>
-          <w:sz w:val="28"/>
-          <w:szCs w:val="28"/>
-        </w:rPr>
-        <w:t xml:space="preserve">CAPITOLO 2 – DESCRIZIONE PRATICA DELL’ARGOMENTO</w:t>
-      </w:r>
-    </w:p>
-    <w:p>
-      <w:pPr>
-        <w:spacing w:after="120" w:line="360"/>
-        <w:jc w:val="both"/>
-      </w:pPr>
-      <w:r>
-        <w:rPr>
-          <w:rFonts w:ascii="Times New Roman" w:cs="Times New Roman" w:eastAsia="Times New Roman" w:hAnsi="Times New Roman"/>
-          <w:sz w:val="24"/>
-          <w:szCs w:val="24"/>
-        </w:rPr>
-        <w:t xml:space="preserve">Il capitolo descrive un caso didattico costruito sulla base delle osservazioni raccolte durante il tirocinio e le lezioni pratiche. Il soggetto è una studentessa di danza classica di 19 anni, con circa dodici anni di pratica, che frequenta cinque lezioni settimanali di tecnica di un’ora e mezza, due delle quali con lavoro sulle punte. Presenta un piede piatto flessibile bilaterale, con arco visibile da seduta e in sollevamento sul tallone e scomparsa dell’arco in carico, valgismo del calcagno più marcato a destra (arto di appoggio abituale), navicolare sporgente, segno delle “troppe dita” positivo a destra, </w:t>
-      </w:r>
-      <w:r>
-        <w:rPr>
-          <w:rFonts w:ascii="Times New Roman" w:cs="Times New Roman" w:eastAsia="Times New Roman" w:hAnsi="Times New Roman"/>
-          <w:i/>
-          <w:iCs/>
-          <w:sz w:val="24"/>
-          <w:szCs w:val="24"/>
-        </w:rPr>
-        <w:t xml:space="preserve">rolling in</w:t>
-      </w:r>
-      <w:r>
-        <w:rPr>
-          <w:rFonts w:ascii="Times New Roman" w:cs="Times New Roman" w:eastAsia="Times New Roman" w:hAnsi="Times New Roman"/>
-          <w:sz w:val="24"/>
-          <w:szCs w:val="24"/>
-        </w:rPr>
-        <w:t xml:space="preserve"> in prima posizione e dorsiflessione limitata a ginocchio esteso. Riferisce affaticamento e tensione del polpaccio e della regione retromalleolare mediale destra dopo le lezioni e nei giorni di punte, crampi plantari serali e tensione dell’alluce destro; nessun dolore notturno, trauma o gonfiore. Il sollevamento monopodalico del tallone è possibile bilateralmente con buona inversione del calcagno; il test di Jack innalza l’arco su entrambi i lati.</w:t>
-      </w:r>
-    </w:p>
-    <w:p>
-      <w:pPr>
-        <w:spacing w:after="120" w:line="360"/>
-        <w:jc w:val="both"/>
-      </w:pPr>
-      <w:r>
-        <w:rPr>
-          <w:rFonts w:ascii="Times New Roman" w:cs="Times New Roman" w:eastAsia="Times New Roman" w:hAnsi="Times New Roman"/>
-          <w:sz w:val="24"/>
-          <w:szCs w:val="24"/>
-        </w:rPr>
-        <w:t xml:space="preserve">Il quadro è compatibile con un sovraccarico funzionale delle strutture che compensano la pronazione (tibiale posteriore, tricipite surale, flessore lungo dell’alluce, intrinseci) in un piede piatto flessibile. In assenza di segni di allarme (dolore a riposo, gonfiore, trauma, incapacità di carico, deficit del sollevamento monopodalico) la situazione rientra nelle competenze dell’operatore MCB; è stato comunque consigliato un controllo del medico sportivo e del fisioterapista della scuola. Gli obiettivi concordati sono la riduzione di tensioni e affaticamento, il miglioramento della mobilità di caviglia e mesopiede, il recupero tra le lezioni e il supporto a un programma di esercizio attivo per il controllo dell’appoggio e del </w:t>
-      </w:r>
-      <w:r>
-        <w:rPr>
-          <w:rFonts w:ascii="Times New Roman" w:cs="Times New Roman" w:eastAsia="Times New Roman" w:hAnsi="Times New Roman"/>
-          <w:i/>
-          <w:iCs/>
-          <w:sz w:val="24"/>
-          <w:szCs w:val="24"/>
-        </w:rPr>
-        <w:t xml:space="preserve">turnout</w:t>
-      </w:r>
-      <w:r>
-        <w:rPr>
-          <w:rFonts w:ascii="Times New Roman" w:cs="Times New Roman" w:eastAsia="Times New Roman" w:hAnsi="Times New Roman"/>
-          <w:sz w:val="24"/>
-          <w:szCs w:val="24"/>
-        </w:rPr>
-        <w:t xml:space="preserve">.</w:t>
-      </w:r>
-    </w:p>
-    <w:p>
-      <w:pPr>
-        <w:pStyle w:val="Heading2"/>
-        <w:keepNext/>
-        <w:spacing w:after="120" w:before="240" w:line="360"/>
-      </w:pPr>
-      <w:r>
-        <w:rPr>
-          <w:rFonts w:ascii="Times New Roman" w:cs="Times New Roman" w:eastAsia="Times New Roman" w:hAnsi="Times New Roman"/>
-          <w:b/>
-          <w:bCs/>
-          <w:color w:val="000000"/>
-          <w:sz w:val="24"/>
-          <w:szCs w:val="24"/>
-        </w:rPr>
-        <w:t xml:space="preserve">2.1 Descrizione del protocollo/trattamento massoterapico</w:t>
-      </w:r>
-    </w:p>
-    <w:p>
-      <w:pPr>
-        <w:spacing w:after="120" w:line="360"/>
-        <w:jc w:val="both"/>
-      </w:pPr>
-      <w:r>
-        <w:rPr>
-          <w:rFonts w:ascii="Times New Roman" w:cs="Times New Roman" w:eastAsia="Times New Roman" w:hAnsi="Times New Roman"/>
-          <w:sz w:val="24"/>
-          <w:szCs w:val="24"/>
-        </w:rPr>
-        <w:t xml:space="preserve">Il trattamento è programmato con cadenza settimanale per sei settimane, della durata di circa 50 minuti, nel giorno più leggero della settimana o dopo il lavoro sulle punte, con funzione di recupero. Ogni seduta inizia con un breve colloquio su sintomi, carico della settimana e tolleranza del trattamento precedente e con l’osservazione dell’appoggio e del sollevamento sul tallone. Le pressioni sono modulate sulla tolleranza della persona, evitando manovre profonde su aree dolenti o gonfie; il massaggio non viene eseguito in presenza di flogosi acuta, sospetta lesione tendinea o frattura da stress, patologie vascolari, infezioni o lesioni cutanee. Il mezzo di scorrimento è un olio neutro in quantità moderata, per consentire anche manovre di presa e stiramento.</w:t>
-      </w:r>
-    </w:p>
-    <w:p>
-      <w:pPr>
-        <w:keepNext/>
-        <w:spacing w:after="60" w:before="120"/>
-        <w:jc w:val="center"/>
-      </w:pPr>
-      <w:r>
-        <w:drawing>
-          <wp:inline distT="0" distB="0" distL="0" distR="0">
-            <wp:extent cx="1800225" cy="1085850"/>
-            <wp:effectExtent t="0" r="0" b="0" l="0"/>
-            <wp:docPr id="1" name="" descr="" title=""/>
-            <wp:cNvGraphicFramePr>
-              <a:graphicFrameLocks xmlns:a="http://schemas.openxmlformats.org/drawingml/2006/main" noChangeAspect="1"/>
-            </wp:cNvGraphicFramePr>
-            <a:graphic xmlns:a="http://schemas.openxmlformats.org/drawingml/2006/main">
-              <a:graphicData uri="http://schemas.openxmlformats.org/drawingml/2006/picture">
-                <pic:pic xmlns:pic="http://schemas.openxmlformats.org/drawingml/2006/picture">
-                  <pic:nvPicPr>
-                    <pic:cNvPr id="0" name="" descr=""/>
-                    <pic:cNvPicPr>
-                      <a:picLocks noChangeAspect="1" noChangeArrowheads="1"/>
-                    </pic:cNvPicPr>
-                  </pic:nvPicPr>
-                  <pic:blipFill>
-                    <a:blip r:embed="rId19" cstate="none"/>
-                    <a:srcRect/>
-                    <a:stretch>
-                      <a:fillRect/>
-                    </a:stretch>
-                  </pic:blipFill>
-                  <pic:spPr bwMode="auto">
-                    <a:xfrm>
-                      <a:off x="0" y="0"/>
                       <a:ext cx="1800225" cy="1085850"/>
                     </a:xfrm>
                     <a:prstGeom prst="rect">
@@ -4616,7 +4554,7 @@
           <w:sz w:val="20"/>
           <w:szCs w:val="20"/>
         </w:rPr>
-        <w:t xml:space="preserve">Figura 11 – Trattamento manuale della pianta del piede.</w:t>
+        <w:t xml:space="preserve">Figura 10 – Trattamento manuale della pianta del piede.</w:t>
       </w:r>
     </w:p>
     <w:p>
@@ -4650,21 +4588,7 @@
           <w:sz w:val="24"/>
           <w:szCs w:val="24"/>
         </w:rPr>
-        <w:t xml:space="preserve">Con la persona in decubito prono e un cuscino sotto le caviglie, il terapista inizia con sfioramenti superficiali e poi profondi della gamba posteriore, dal tallone al cavo popliteo, per 2-3 minuti, per preparare i tessuti e favorire il ritorno venoso. Prosegue con impastamenti a mani alterne sui due ventri del gastrocnemio, seguendo la direzione delle fibre, e quindi sul soleo, che raggiunge ai lati dei gastrocnemi con presa più profonda a ginocchio flesso di circa 30°, posizione che detende il gastrocnemio. Esegue scorrimenti profondi con i pollici lungo i setti intermuscolari, dal basso verso l’alto, e pressioni statiche di 20-30 secondi sui punti di maggiore tensione, soprattutto nel soleo distale. Sul tendine d’Achille applica un pinzamento e una mobilizzazione trasversale delicata tra pollice e indice e frizioni leggere ai margini, evitando il tendine se dolente alla pressione.</w:t>
-      </w:r>
-    </w:p>
-    <w:p>
-      <w:pPr>
-        <w:spacing w:after="120" w:line="360"/>
-        <w:jc w:val="both"/>
-      </w:pPr>
-      <w:r>
-        <w:rPr>
-          <w:rFonts w:ascii="Times New Roman" w:cs="Times New Roman" w:eastAsia="Times New Roman" w:hAnsi="Times New Roman"/>
-          <w:sz w:val="24"/>
-          <w:szCs w:val="24"/>
-        </w:rPr>
-        <w:t xml:space="preserve">Passa poi al compartimento posteriore profondo: con il pollice o le dita a uncino lavora lungo il margine postero-mediale della tibia, dove tibiale posteriore e flessore lungo delle dita sono raggiungibili dietro il bordo osseo, con scorrimenti lenti verso il malleolo mediale e pressioni mantenute sui punti più sensibili; la regione retromalleolare mediale viene trattata solo con scorrimenti leggeri e mobilizzazione del tendine nella sua guaina, mai con frizioni profonde, data la presenza del fascio vascolo-nervoso tibiale. Il flessore lungo dell’alluce viene trattato nella porzione muscolare, sul versante posteriore della fibula, con pressioni associate a flesso-estensioni passive dell’alluce per far scorrere il tendine.</w:t>
+        <w:t xml:space="preserve">In decubito prono, il terapista inizia con sfioramenti superficiali e poi profondi della gamba posteriore, dal tallone al cavo popliteo, per 2-3 minuti, per preparare i tessuti e favorire il ritorno venoso. Prosegue con impastamenti a mani alterne sui due ventri del gastrocnemio e quindi sul soleo, raggiunto ai lati dei gastrocnemi a ginocchio flesso di circa 30°. Esegue scorrimenti profondi con i pollici lungo i setti intermuscolari e pressioni statiche di 20-30 secondi sui punti di maggiore tensione, soprattutto nel soleo distale; sul tendine d’Achille applica pinzamento e mobilizzazione trasversale delicata, evitando il tendine se dolente. Passa poi al compartimento posteriore profondo: con il pollice a uncino lavora lungo il margine postero-mediale della tibia, dove tibiale posteriore e flessore lungo delle dita sono raggiungibili dietro il bordo osseo, con scorrimenti lenti verso il malleolo mediale e pressioni mantenute; la regione retromalleolare mediale viene trattata solo con scorrimenti leggeri, mai con frizioni profonde, per la presenza del fascio vascolo-nervoso tibiale. Il flessore lungo dell’alluce viene trattato nella porzione muscolare, dietro la fibula, con pressioni associate a flesso-estensioni passive dell’alluce.</w:t>
       </w:r>
     </w:p>
     <w:p>
@@ -4698,25 +4622,7 @@
           <w:sz w:val="24"/>
           <w:szCs w:val="24"/>
         </w:rPr>
-        <w:t xml:space="preserve">In decubito prono con il ginocchio flesso a 90°, il terapista sostiene il dorso del piede con una mano e lavora con l’altra sulla pianta. Inizia con sfioramenti e pressioni scivolate dal tallone verso le teste metatarsali, quindi con pressioni a pollici alternati lungo le tre bande dell’aponeurosi plantare, dal tubercolo mediale del calcagno verso le dita, mantenendo l’aponeurosi in leggera tensione con l’estensione passiva delle dita (posizione di </w:t>
-      </w:r>
-      <w:r>
-        <w:rPr>
-          <w:rFonts w:ascii="Times New Roman" w:cs="Times New Roman" w:eastAsia="Times New Roman" w:hAnsi="Times New Roman"/>
-          <w:i/>
-          <w:iCs/>
-          <w:sz w:val="24"/>
-          <w:szCs w:val="24"/>
-        </w:rPr>
-        <w:t xml:space="preserve">windlass</w:t>
-      </w:r>
-      <w:r>
-        <w:rPr>
-          <w:rFonts w:ascii="Times New Roman" w:cs="Times New Roman" w:eastAsia="Times New Roman" w:hAnsi="Times New Roman"/>
-          <w:sz w:val="24"/>
-          <w:szCs w:val="24"/>
-        </w:rPr>
-        <w:t xml:space="preserve">); sull’inserzione calcaneare, se non dolente, esegue frizioni circolari leggere. Prosegue con impastamenti digitali del comparto mediale (abduttore e flessore breve dell’alluce, lungo il margine dell’arco) e laterale (abduttore del quinto dito), con pressioni puntiformi negli spazi intermetatarsali per interossei e lombricali e con la mobilizzazione delle teste metatarsali, afferrate tra pollice e indice e mosse in senso plantare e dorsale l’una rispetto all’altra. Sul primo raggio esegue scorrimenti lungo il tendine del flessore lungo dell’alluce e una leggera trazione dell’alluce; conclude con pressioni profonde, ma tollerate, dell’intera pianta con il pugno chiuso e sfioramenti di ritorno.</w:t>
+        <w:t xml:space="preserve">In decubito prono con il ginocchio flesso a 90°, il terapista sostiene il dorso del piede con una mano e lavora con l’altra sulla pianta. Inizia con sfioramenti e pressioni scivolate dal tallone verso le teste metatarsali, quindi con pressioni a pollici alternati lungo le tre bande dell’aponeurosi plantare, dal calcagno verso le dita; sull’inserzione calcaneare, se non dolente, esegue frizioni circolari leggere. Prosegue con impastamenti digitali del comparto mediale (abduttore e flessore breve dell’alluce) e laterale (abduttore del quinto dito), pressioni puntiformi negli spazi intermetatarsali per interossei e lombricali e mobilizzazione delle teste metatarsali, mosse in senso plantare e dorsale l’una rispetto all’altra. Conclude con una leggera trazione dell’alluce, pressioni profonde ma tollerate dell’intera pianta con il pugno chiuso e sfioramenti di ritorno. Il lavoro miofasciale specifico sulla pianta è descritto nel paragrafo 2.2.2.</w:t>
       </w:r>
     </w:p>
     <w:p>
@@ -4750,7 +4656,7 @@
           <w:sz w:val="24"/>
           <w:szCs w:val="24"/>
         </w:rPr>
-        <w:t xml:space="preserve">In decubito supino, il terapista tratta i peronei con scorrimenti e impastamenti digitali lungo la faccia laterale della fibula fino alla regione retromalleolare, dove mobilizza i tendini con movimenti trasversali delicati associati a inversione-eversione passiva; nel soggetto pronato i peronei sono spesso accorciati e dolenti e il lavoro è completato da un allungamento manuale in inversione. Tratta poi il tibiale anteriore con scorrimenti profondi lungo la cresta tibiale e gli estensori nella parte distale della gamba; sul dorso del piede esegue sfioramenti, mobilizzazione dei retinacoli e scorrimenti intermetatarsali, e termina con pressioni leggere sul tunnel tarsale e sul seno del tarso.</w:t>
+        <w:t xml:space="preserve">In decubito supino, il terapista tratta i peronei con scorrimenti e impastamenti digitali lungo la fibula fino alla regione retromalleolare, dove mobilizza i tendini con movimenti trasversali associati a inversione-eversione passiva; nel soggetto pronato i peronei sono spesso accorciati e il lavoro è completato da un allungamento in inversione. Tratta poi il tibiale anteriore con scorrimenti profondi lungo la cresta tibiale e, sul dorso del piede, esegue sfioramenti, mobilizzazione dei retinacoli e scorrimenti intermetatarsali.</w:t>
       </w:r>
     </w:p>
     <w:p>
@@ -4820,7 +4726,7 @@
           <w:sz w:val="24"/>
           <w:szCs w:val="24"/>
         </w:rPr>
-        <w:t xml:space="preserve"> compensato, il terapista dedica gli ultimi 10-12 minuti alla catena prossimale: in decubito laterale e prono tratta con impastamenti e pressioni il gluteo medio, i rotatori esterni profondi dell’anca (piriforme e otturatori, attraverso il grande gluteo) e il tensore della fascia lata, spesso ipertonici nel danzatore che “tira” il </w:t>
+        <w:t xml:space="preserve"> compensato, il terapista dedica gli ultimi 10-12 minuti alla catena prossimale: in decubito laterale e prono tratta con impastamenti e pressioni il gluteo medio, i rotatori esterni profondi dell’anca e il tensore della fascia lata, spesso ipertonici nel danzatore che “tira” il </w:t>
       </w:r>
       <w:r>
         <w:rPr>
@@ -4838,632 +4744,7 @@
           <w:sz w:val="24"/>
           <w:szCs w:val="24"/>
         </w:rPr>
-        <w:t xml:space="preserve">, e in decubito supino gli adduttori. La seduta termina con sfioramenti di ritorno, con lo stiramento manuale del tricipite surale (dorsiflessione passiva lenta a ginocchio esteso e flesso, 2-3 ripetizioni di 20-30 secondi) e con l’invito a percepire, in piedi, l’appoggio sui tre punti del piede.</w:t>
-      </w:r>
-    </w:p>
-    <w:tbl>
-      <w:tblPr>
-        <w:tblW w:type="dxa" w:w="8505"/>
-        <w:tblBorders>
-          <w:top w:val="single" w:color="auto" w:sz="4"/>
-          <w:left w:val="single" w:color="auto" w:sz="4"/>
-          <w:bottom w:val="single" w:color="auto" w:sz="4"/>
-          <w:right w:val="single" w:color="auto" w:sz="4"/>
-          <w:insideH w:val="single" w:color="auto" w:sz="4"/>
-          <w:insideV w:val="single" w:color="auto" w:sz="4"/>
-        </w:tblBorders>
-      </w:tblPr>
-      <w:tblGrid>
-        <w:gridCol w:w="2126"/>
-        <w:gridCol w:w="2126"/>
-        <w:gridCol w:w="2126"/>
-        <w:gridCol w:w="2126"/>
-      </w:tblGrid>
-      <w:tr>
-        <w:trPr>
-          <w:cantSplit/>
-          <w:tblHeader/>
-        </w:trPr>
-        <w:tc>
-          <w:tcPr>
-            <w:tcW w:type="dxa" w:w="2126"/>
-            <w:shd w:fill="E7E6E6" w:color="auto" w:val="clear"/>
-            <w:tcMar>
-              <w:top w:type="dxa" w:w="40"/>
-              <w:left w:type="dxa" w:w="70"/>
-              <w:bottom w:type="dxa" w:w="40"/>
-              <w:right w:type="dxa" w:w="70"/>
-            </w:tcMar>
-            <w:vAlign w:val="center"/>
-          </w:tcPr>
-          <w:p>
-            <w:pPr>
-              <w:keepLines/>
-              <w:spacing w:after="0" w:line="240"/>
-            </w:pPr>
-            <w:r>
-              <w:rPr>
-                <w:rFonts w:ascii="Times New Roman" w:cs="Times New Roman" w:eastAsia="Times New Roman" w:hAnsi="Times New Roman"/>
-                <w:b/>
-                <w:bCs/>
-                <w:sz w:val="18"/>
-                <w:szCs w:val="18"/>
-              </w:rPr>
-              <w:t xml:space="preserve">Fase e posizione</w:t>
-            </w:r>
-          </w:p>
-        </w:tc>
-        <w:tc>
-          <w:tcPr>
-            <w:tcW w:type="dxa" w:w="2126"/>
-            <w:shd w:fill="E7E6E6" w:color="auto" w:val="clear"/>
-            <w:tcMar>
-              <w:top w:type="dxa" w:w="40"/>
-              <w:left w:type="dxa" w:w="70"/>
-              <w:bottom w:type="dxa" w:w="40"/>
-              <w:right w:type="dxa" w:w="70"/>
-            </w:tcMar>
-            <w:vAlign w:val="center"/>
-          </w:tcPr>
-          <w:p>
-            <w:pPr>
-              <w:keepLines/>
-              <w:spacing w:after="0" w:line="240"/>
-            </w:pPr>
-            <w:r>
-              <w:rPr>
-                <w:rFonts w:ascii="Times New Roman" w:cs="Times New Roman" w:eastAsia="Times New Roman" w:hAnsi="Times New Roman"/>
-                <w:b/>
-                <w:bCs/>
-                <w:sz w:val="18"/>
-                <w:szCs w:val="18"/>
-              </w:rPr>
-              <w:t xml:space="preserve">Strutture trattate</w:t>
-            </w:r>
-          </w:p>
-        </w:tc>
-        <w:tc>
-          <w:tcPr>
-            <w:tcW w:type="dxa" w:w="2126"/>
-            <w:shd w:fill="E7E6E6" w:color="auto" w:val="clear"/>
-            <w:tcMar>
-              <w:top w:type="dxa" w:w="40"/>
-              <w:left w:type="dxa" w:w="70"/>
-              <w:bottom w:type="dxa" w:w="40"/>
-              <w:right w:type="dxa" w:w="70"/>
-            </w:tcMar>
-            <w:vAlign w:val="center"/>
-          </w:tcPr>
-          <w:p>
-            <w:pPr>
-              <w:keepLines/>
-              <w:spacing w:after="0" w:line="240"/>
-            </w:pPr>
-            <w:r>
-              <w:rPr>
-                <w:rFonts w:ascii="Times New Roman" w:cs="Times New Roman" w:eastAsia="Times New Roman" w:hAnsi="Times New Roman"/>
-                <w:b/>
-                <w:bCs/>
-                <w:sz w:val="18"/>
-                <w:szCs w:val="18"/>
-              </w:rPr>
-              <w:t xml:space="preserve">Tecniche principali</w:t>
-            </w:r>
-          </w:p>
-        </w:tc>
-        <w:tc>
-          <w:tcPr>
-            <w:tcW w:type="dxa" w:w="2126"/>
-            <w:shd w:fill="E7E6E6" w:color="auto" w:val="clear"/>
-            <w:tcMar>
-              <w:top w:type="dxa" w:w="40"/>
-              <w:left w:type="dxa" w:w="70"/>
-              <w:bottom w:type="dxa" w:w="40"/>
-              <w:right w:type="dxa" w:w="70"/>
-            </w:tcMar>
-            <w:vAlign w:val="center"/>
-          </w:tcPr>
-          <w:p>
-            <w:pPr>
-              <w:keepLines/>
-              <w:spacing w:after="0" w:line="240"/>
-            </w:pPr>
-            <w:r>
-              <w:rPr>
-                <w:rFonts w:ascii="Times New Roman" w:cs="Times New Roman" w:eastAsia="Times New Roman" w:hAnsi="Times New Roman"/>
-                <w:b/>
-                <w:bCs/>
-                <w:sz w:val="18"/>
-                <w:szCs w:val="18"/>
-              </w:rPr>
-              <w:t xml:space="preserve">Obiettivo</w:t>
-            </w:r>
-          </w:p>
-        </w:tc>
-      </w:tr>
-      <w:tr>
-        <w:trPr>
-          <w:cantSplit/>
-        </w:trPr>
-        <w:tc>
-          <w:tcPr>
-            <w:tcW w:type="dxa" w:w="2126"/>
-            <w:tcMar>
-              <w:top w:type="dxa" w:w="40"/>
-              <w:left w:type="dxa" w:w="70"/>
-              <w:bottom w:type="dxa" w:w="40"/>
-              <w:right w:type="dxa" w:w="70"/>
-            </w:tcMar>
-            <w:vAlign w:val="center"/>
-          </w:tcPr>
-          <w:p>
-            <w:pPr>
-              <w:keepLines/>
-              <w:spacing w:after="0" w:line="240"/>
-            </w:pPr>
-            <w:r>
-              <w:rPr>
-                <w:rFonts w:ascii="Times New Roman" w:cs="Times New Roman" w:eastAsia="Times New Roman" w:hAnsi="Times New Roman"/>
-                <w:b w:val="false"/>
-                <w:bCs w:val="false"/>
-                <w:sz w:val="18"/>
-                <w:szCs w:val="18"/>
-              </w:rPr>
-              <w:t xml:space="preserve">1 – Prono (15 min)</w:t>
-            </w:r>
-          </w:p>
-        </w:tc>
-        <w:tc>
-          <w:tcPr>
-            <w:tcW w:type="dxa" w:w="2126"/>
-            <w:tcMar>
-              <w:top w:type="dxa" w:w="40"/>
-              <w:left w:type="dxa" w:w="70"/>
-              <w:bottom w:type="dxa" w:w="40"/>
-              <w:right w:type="dxa" w:w="70"/>
-            </w:tcMar>
-            <w:vAlign w:val="center"/>
-          </w:tcPr>
-          <w:p>
-            <w:pPr>
-              <w:keepLines/>
-              <w:spacing w:after="0" w:line="240"/>
-            </w:pPr>
-            <w:r>
-              <w:rPr>
-                <w:rFonts w:ascii="Times New Roman" w:cs="Times New Roman" w:eastAsia="Times New Roman" w:hAnsi="Times New Roman"/>
-                <w:b w:val="false"/>
-                <w:bCs w:val="false"/>
-                <w:sz w:val="18"/>
-                <w:szCs w:val="18"/>
-              </w:rPr>
-              <w:t xml:space="preserve">Tricipite surale, tendine d’Achille, tibiale posteriore, flessore lungo dell’alluce</w:t>
-            </w:r>
-          </w:p>
-        </w:tc>
-        <w:tc>
-          <w:tcPr>
-            <w:tcW w:type="dxa" w:w="2126"/>
-            <w:tcMar>
-              <w:top w:type="dxa" w:w="40"/>
-              <w:left w:type="dxa" w:w="70"/>
-              <w:bottom w:type="dxa" w:w="40"/>
-              <w:right w:type="dxa" w:w="70"/>
-            </w:tcMar>
-            <w:vAlign w:val="center"/>
-          </w:tcPr>
-          <w:p>
-            <w:pPr>
-              <w:keepLines/>
-              <w:spacing w:after="0" w:line="240"/>
-            </w:pPr>
-            <w:r>
-              <w:rPr>
-                <w:rFonts w:ascii="Times New Roman" w:cs="Times New Roman" w:eastAsia="Times New Roman" w:hAnsi="Times New Roman"/>
-                <w:b w:val="false"/>
-                <w:bCs w:val="false"/>
-                <w:sz w:val="18"/>
-                <w:szCs w:val="18"/>
-              </w:rPr>
-              <w:t xml:space="preserve">Sfioramenti, impastamenti, scorrimenti profondi, pressioni statiche</w:t>
-            </w:r>
-          </w:p>
-        </w:tc>
-        <w:tc>
-          <w:tcPr>
-            <w:tcW w:type="dxa" w:w="2126"/>
-            <w:tcMar>
-              <w:top w:type="dxa" w:w="40"/>
-              <w:left w:type="dxa" w:w="70"/>
-              <w:bottom w:type="dxa" w:w="40"/>
-              <w:right w:type="dxa" w:w="70"/>
-            </w:tcMar>
-            <w:vAlign w:val="center"/>
-          </w:tcPr>
-          <w:p>
-            <w:pPr>
-              <w:keepLines/>
-              <w:spacing w:after="0" w:line="240"/>
-            </w:pPr>
-            <w:r>
-              <w:rPr>
-                <w:rFonts w:ascii="Times New Roman" w:cs="Times New Roman" w:eastAsia="Times New Roman" w:hAnsi="Times New Roman"/>
-                <w:b w:val="false"/>
-                <w:bCs w:val="false"/>
-                <w:sz w:val="18"/>
-                <w:szCs w:val="18"/>
-              </w:rPr>
-              <w:t xml:space="preserve">Detendere la catena posteriore e gli stabilizzatori dell’arco</w:t>
-            </w:r>
-          </w:p>
-        </w:tc>
-      </w:tr>
-      <w:tr>
-        <w:trPr>
-          <w:cantSplit/>
-        </w:trPr>
-        <w:tc>
-          <w:tcPr>
-            <w:tcW w:type="dxa" w:w="2126"/>
-            <w:tcMar>
-              <w:top w:type="dxa" w:w="40"/>
-              <w:left w:type="dxa" w:w="70"/>
-              <w:bottom w:type="dxa" w:w="40"/>
-              <w:right w:type="dxa" w:w="70"/>
-            </w:tcMar>
-            <w:vAlign w:val="center"/>
-          </w:tcPr>
-          <w:p>
-            <w:pPr>
-              <w:keepLines/>
-              <w:spacing w:after="0" w:line="240"/>
-            </w:pPr>
-            <w:r>
-              <w:rPr>
-                <w:rFonts w:ascii="Times New Roman" w:cs="Times New Roman" w:eastAsia="Times New Roman" w:hAnsi="Times New Roman"/>
-                <w:b w:val="false"/>
-                <w:bCs w:val="false"/>
-                <w:sz w:val="18"/>
-                <w:szCs w:val="18"/>
-              </w:rPr>
-              <w:t xml:space="preserve">2 – Prono, ginocchio flesso (10 min)</w:t>
-            </w:r>
-          </w:p>
-        </w:tc>
-        <w:tc>
-          <w:tcPr>
-            <w:tcW w:type="dxa" w:w="2126"/>
-            <w:tcMar>
-              <w:top w:type="dxa" w:w="40"/>
-              <w:left w:type="dxa" w:w="70"/>
-              <w:bottom w:type="dxa" w:w="40"/>
-              <w:right w:type="dxa" w:w="70"/>
-            </w:tcMar>
-            <w:vAlign w:val="center"/>
-          </w:tcPr>
-          <w:p>
-            <w:pPr>
-              <w:keepLines/>
-              <w:spacing w:after="0" w:line="240"/>
-            </w:pPr>
-            <w:r>
-              <w:rPr>
-                <w:rFonts w:ascii="Times New Roman" w:cs="Times New Roman" w:eastAsia="Times New Roman" w:hAnsi="Times New Roman"/>
-                <w:b w:val="false"/>
-                <w:bCs w:val="false"/>
-                <w:sz w:val="18"/>
-                <w:szCs w:val="18"/>
-              </w:rPr>
-              <w:t xml:space="preserve">Aponeurosi plantare, intrinseci, interossei, primo raggio</w:t>
-            </w:r>
-          </w:p>
-        </w:tc>
-        <w:tc>
-          <w:tcPr>
-            <w:tcW w:type="dxa" w:w="2126"/>
-            <w:tcMar>
-              <w:top w:type="dxa" w:w="40"/>
-              <w:left w:type="dxa" w:w="70"/>
-              <w:bottom w:type="dxa" w:w="40"/>
-              <w:right w:type="dxa" w:w="70"/>
-            </w:tcMar>
-            <w:vAlign w:val="center"/>
-          </w:tcPr>
-          <w:p>
-            <w:pPr>
-              <w:keepLines/>
-              <w:spacing w:after="0" w:line="240"/>
-            </w:pPr>
-            <w:r>
-              <w:rPr>
-                <w:rFonts w:ascii="Times New Roman" w:cs="Times New Roman" w:eastAsia="Times New Roman" w:hAnsi="Times New Roman"/>
-                <w:b w:val="false"/>
-                <w:bCs w:val="false"/>
-                <w:sz w:val="18"/>
-                <w:szCs w:val="18"/>
-              </w:rPr>
-              <w:t xml:space="preserve">Pressioni a pollici, frizioni, mobilizzazione delle teste metatarsali</w:t>
-            </w:r>
-          </w:p>
-        </w:tc>
-        <w:tc>
-          <w:tcPr>
-            <w:tcW w:type="dxa" w:w="2126"/>
-            <w:tcMar>
-              <w:top w:type="dxa" w:w="40"/>
-              <w:left w:type="dxa" w:w="70"/>
-              <w:bottom w:type="dxa" w:w="40"/>
-              <w:right w:type="dxa" w:w="70"/>
-            </w:tcMar>
-            <w:vAlign w:val="center"/>
-          </w:tcPr>
-          <w:p>
-            <w:pPr>
-              <w:keepLines/>
-              <w:spacing w:after="0" w:line="240"/>
-            </w:pPr>
-            <w:r>
-              <w:rPr>
-                <w:rFonts w:ascii="Times New Roman" w:cs="Times New Roman" w:eastAsia="Times New Roman" w:hAnsi="Times New Roman"/>
-                <w:b w:val="false"/>
-                <w:bCs w:val="false"/>
-                <w:sz w:val="18"/>
-                <w:szCs w:val="18"/>
-              </w:rPr>
-              <w:t xml:space="preserve">Comfort plantare, elasticità, percezione dell’appoggio</w:t>
-            </w:r>
-          </w:p>
-        </w:tc>
-      </w:tr>
-      <w:tr>
-        <w:trPr>
-          <w:cantSplit/>
-        </w:trPr>
-        <w:tc>
-          <w:tcPr>
-            <w:tcW w:type="dxa" w:w="2126"/>
-            <w:tcMar>
-              <w:top w:type="dxa" w:w="40"/>
-              <w:left w:type="dxa" w:w="70"/>
-              <w:bottom w:type="dxa" w:w="40"/>
-              <w:right w:type="dxa" w:w="70"/>
-            </w:tcMar>
-            <w:vAlign w:val="center"/>
-          </w:tcPr>
-          <w:p>
-            <w:pPr>
-              <w:keepLines/>
-              <w:spacing w:after="0" w:line="240"/>
-            </w:pPr>
-            <w:r>
-              <w:rPr>
-                <w:rFonts w:ascii="Times New Roman" w:cs="Times New Roman" w:eastAsia="Times New Roman" w:hAnsi="Times New Roman"/>
-                <w:b w:val="false"/>
-                <w:bCs w:val="false"/>
-                <w:sz w:val="18"/>
-                <w:szCs w:val="18"/>
-              </w:rPr>
-              <w:t xml:space="preserve">3 – Supino (10 min)</w:t>
-            </w:r>
-          </w:p>
-        </w:tc>
-        <w:tc>
-          <w:tcPr>
-            <w:tcW w:type="dxa" w:w="2126"/>
-            <w:tcMar>
-              <w:top w:type="dxa" w:w="40"/>
-              <w:left w:type="dxa" w:w="70"/>
-              <w:bottom w:type="dxa" w:w="40"/>
-              <w:right w:type="dxa" w:w="70"/>
-            </w:tcMar>
-            <w:vAlign w:val="center"/>
-          </w:tcPr>
-          <w:p>
-            <w:pPr>
-              <w:keepLines/>
-              <w:spacing w:after="0" w:line="240"/>
-            </w:pPr>
-            <w:r>
-              <w:rPr>
-                <w:rFonts w:ascii="Times New Roman" w:cs="Times New Roman" w:eastAsia="Times New Roman" w:hAnsi="Times New Roman"/>
-                <w:b w:val="false"/>
-                <w:bCs w:val="false"/>
-                <w:sz w:val="18"/>
-                <w:szCs w:val="18"/>
-              </w:rPr>
-              <w:t xml:space="preserve">Peronei, tibiale anteriore, estensori, retinacoli</w:t>
-            </w:r>
-          </w:p>
-        </w:tc>
-        <w:tc>
-          <w:tcPr>
-            <w:tcW w:type="dxa" w:w="2126"/>
-            <w:tcMar>
-              <w:top w:type="dxa" w:w="40"/>
-              <w:left w:type="dxa" w:w="70"/>
-              <w:bottom w:type="dxa" w:w="40"/>
-              <w:right w:type="dxa" w:w="70"/>
-            </w:tcMar>
-            <w:vAlign w:val="center"/>
-          </w:tcPr>
-          <w:p>
-            <w:pPr>
-              <w:keepLines/>
-              <w:spacing w:after="0" w:line="240"/>
-            </w:pPr>
-            <w:r>
-              <w:rPr>
-                <w:rFonts w:ascii="Times New Roman" w:cs="Times New Roman" w:eastAsia="Times New Roman" w:hAnsi="Times New Roman"/>
-                <w:b w:val="false"/>
-                <w:bCs w:val="false"/>
-                <w:sz w:val="18"/>
-                <w:szCs w:val="18"/>
-              </w:rPr>
-              <w:t xml:space="preserve">Scorrimenti, impastamenti, allungamento in inversione</w:t>
-            </w:r>
-          </w:p>
-        </w:tc>
-        <w:tc>
-          <w:tcPr>
-            <w:tcW w:type="dxa" w:w="2126"/>
-            <w:tcMar>
-              <w:top w:type="dxa" w:w="40"/>
-              <w:left w:type="dxa" w:w="70"/>
-              <w:bottom w:type="dxa" w:w="40"/>
-              <w:right w:type="dxa" w:w="70"/>
-            </w:tcMar>
-            <w:vAlign w:val="center"/>
-          </w:tcPr>
-          <w:p>
-            <w:pPr>
-              <w:keepLines/>
-              <w:spacing w:after="0" w:line="240"/>
-            </w:pPr>
-            <w:r>
-              <w:rPr>
-                <w:rFonts w:ascii="Times New Roman" w:cs="Times New Roman" w:eastAsia="Times New Roman" w:hAnsi="Times New Roman"/>
-                <w:b w:val="false"/>
-                <w:bCs w:val="false"/>
-                <w:sz w:val="18"/>
-                <w:szCs w:val="18"/>
-              </w:rPr>
-              <w:t xml:space="preserve">Riequilibrio tra evertitori e invertitori</w:t>
-            </w:r>
-          </w:p>
-        </w:tc>
-      </w:tr>
-      <w:tr>
-        <w:trPr>
-          <w:cantSplit/>
-        </w:trPr>
-        <w:tc>
-          <w:tcPr>
-            <w:tcW w:type="dxa" w:w="2126"/>
-            <w:tcMar>
-              <w:top w:type="dxa" w:w="40"/>
-              <w:left w:type="dxa" w:w="70"/>
-              <w:bottom w:type="dxa" w:w="40"/>
-              <w:right w:type="dxa" w:w="70"/>
-            </w:tcMar>
-            <w:vAlign w:val="center"/>
-          </w:tcPr>
-          <w:p>
-            <w:pPr>
-              <w:keepLines/>
-              <w:spacing w:after="0" w:line="240"/>
-            </w:pPr>
-            <w:r>
-              <w:rPr>
-                <w:rFonts w:ascii="Times New Roman" w:cs="Times New Roman" w:eastAsia="Times New Roman" w:hAnsi="Times New Roman"/>
-                <w:b w:val="false"/>
-                <w:bCs w:val="false"/>
-                <w:sz w:val="18"/>
-                <w:szCs w:val="18"/>
-              </w:rPr>
-              <w:t xml:space="preserve">4 – Laterale/prono/supino (12 min)</w:t>
-            </w:r>
-          </w:p>
-        </w:tc>
-        <w:tc>
-          <w:tcPr>
-            <w:tcW w:type="dxa" w:w="2126"/>
-            <w:tcMar>
-              <w:top w:type="dxa" w:w="40"/>
-              <w:left w:type="dxa" w:w="70"/>
-              <w:bottom w:type="dxa" w:w="40"/>
-              <w:right w:type="dxa" w:w="70"/>
-            </w:tcMar>
-            <w:vAlign w:val="center"/>
-          </w:tcPr>
-          <w:p>
-            <w:pPr>
-              <w:keepLines/>
-              <w:spacing w:after="0" w:line="240"/>
-            </w:pPr>
-            <w:r>
-              <w:rPr>
-                <w:rFonts w:ascii="Times New Roman" w:cs="Times New Roman" w:eastAsia="Times New Roman" w:hAnsi="Times New Roman"/>
-                <w:b w:val="false"/>
-                <w:bCs w:val="false"/>
-                <w:sz w:val="18"/>
-                <w:szCs w:val="18"/>
-              </w:rPr>
-              <w:t xml:space="preserve">Gluteo medio, rotatori esterni, tensore della fascia lata, adduttori</w:t>
-            </w:r>
-          </w:p>
-        </w:tc>
-        <w:tc>
-          <w:tcPr>
-            <w:tcW w:type="dxa" w:w="2126"/>
-            <w:tcMar>
-              <w:top w:type="dxa" w:w="40"/>
-              <w:left w:type="dxa" w:w="70"/>
-              <w:bottom w:type="dxa" w:w="40"/>
-              <w:right w:type="dxa" w:w="70"/>
-            </w:tcMar>
-            <w:vAlign w:val="center"/>
-          </w:tcPr>
-          <w:p>
-            <w:pPr>
-              <w:keepLines/>
-              <w:spacing w:after="0" w:line="240"/>
-            </w:pPr>
-            <w:r>
-              <w:rPr>
-                <w:rFonts w:ascii="Times New Roman" w:cs="Times New Roman" w:eastAsia="Times New Roman" w:hAnsi="Times New Roman"/>
-                <w:b w:val="false"/>
-                <w:bCs w:val="false"/>
-                <w:sz w:val="18"/>
-                <w:szCs w:val="18"/>
-              </w:rPr>
-              <w:t xml:space="preserve">Impastamenti, pressioni, stiramento del tricipite</w:t>
-            </w:r>
-          </w:p>
-        </w:tc>
-        <w:tc>
-          <w:tcPr>
-            <w:tcW w:type="dxa" w:w="2126"/>
-            <w:tcMar>
-              <w:top w:type="dxa" w:w="40"/>
-              <w:left w:type="dxa" w:w="70"/>
-              <w:bottom w:type="dxa" w:w="40"/>
-              <w:right w:type="dxa" w:w="70"/>
-            </w:tcMar>
-            <w:vAlign w:val="center"/>
-          </w:tcPr>
-          <w:p>
-            <w:pPr>
-              <w:keepLines/>
-              <w:spacing w:after="0" w:line="240"/>
-            </w:pPr>
-            <w:r>
-              <w:rPr>
-                <w:rFonts w:ascii="Times New Roman" w:cs="Times New Roman" w:eastAsia="Times New Roman" w:hAnsi="Times New Roman"/>
-                <w:b w:val="false"/>
-                <w:bCs w:val="false"/>
-                <w:sz w:val="18"/>
-                <w:szCs w:val="18"/>
-              </w:rPr>
-              <w:t xml:space="preserve">Turnout dall’anca, controllo prossimale</w:t>
-            </w:r>
-          </w:p>
-        </w:tc>
-      </w:tr>
-    </w:tbl>
-    <w:p>
-      <w:pPr>
-        <w:spacing w:after="120"/>
-        <w:jc w:val="center"/>
-      </w:pPr>
-      <w:r>
-        <w:rPr>
-          <w:rFonts w:ascii="Times New Roman" w:cs="Times New Roman" w:eastAsia="Times New Roman" w:hAnsi="Times New Roman"/>
-          <w:i/>
-          <w:iCs/>
-          <w:sz w:val="20"/>
-          <w:szCs w:val="20"/>
-        </w:rPr>
-        <w:t xml:space="preserve">Tabella 1 – Sintesi del protocollo massoterapico (durata indicativa complessiva 50 minuti circa).</w:t>
+        <w:t xml:space="preserve">, e in supino gli adduttori. La seduta termina con lo stiramento manuale del tricipite surale (dorsiflessione passiva lenta a ginocchio esteso e flesso, 2-3 ripetizioni di 20-30 secondi) e con l’invito a percepire, in piedi, l’appoggio sui tre punti del piede.</w:t>
       </w:r>
     </w:p>
     <w:p>
@@ -5477,7 +4758,7 @@
           <w:sz w:val="24"/>
           <w:szCs w:val="24"/>
         </w:rPr>
-        <w:t xml:space="preserve">Nel corso delle sei settimane la studentessa ha riferito una progressiva riduzione della tensione del polpaccio e della regione retromalleolare dopo le lezioni e la scomparsa dei crampi serali; la morfologia dell’arco, come atteso, non è cambiata, mentre sono migliorate la tolleranza del carico e la qualità percepita del </w:t>
+        <w:t xml:space="preserve">Nel corso delle sei settimane la studentessa ha riferito una progressiva riduzione della tensione del polpaccio e della regione retromalleolare dopo le lezioni e la scomparsa dei crampi serali; la morfologia dell’arco, come atteso, non è cambiata, mentre sono migliorate la tolleranza del carico e la qualità del </w:t>
       </w:r>
       <w:r>
         <w:rPr>
@@ -5495,7 +4776,7 @@
           <w:sz w:val="24"/>
           <w:szCs w:val="24"/>
         </w:rPr>
-        <w:t xml:space="preserve">, soprattutto in associazione agli esercizi del paragrafo seguente: un miglioramento del comfort e della funzione, non una correzione strutturale.</w:t>
+        <w:t xml:space="preserve">: un miglioramento funzionale, non strutturale.</w:t>
       </w:r>
     </w:p>
     <w:p>
@@ -5547,7 +4828,7 @@
           <w:sz w:val="24"/>
           <w:szCs w:val="24"/>
         </w:rPr>
-        <w:t xml:space="preserve">Le mobilizzazioni articolari vengono eseguite al termine del lavoro sui tessuti molli, con tecniche a bassa velocità e di piccola ampiezza, oscillatorie o mantenute, nel rispetto delle competenze dell’operatore e senza manipolazioni ad alta velocità.</w:t>
+        <w:t xml:space="preserve">Le mobilizzazioni articolari seguono il lavoro sui tessuti molli, con tecniche a bassa velocità e di piccola ampiezza, oscillatorie o mantenute, senza manipolazioni ad alta velocità.</w:t>
       </w:r>
       <w:r>
         <w:rPr>
@@ -5561,7 +4842,7 @@
           <w:sz w:val="24"/>
           <w:szCs w:val="24"/>
         </w:rPr>
-        <w:t xml:space="preserve"> Alla caviglia esegue la trazione longitudinale della talocrurale e lo scivolamento posteriore dell’astragalo (con la persona supina, una mano stabilizza la tibia e l’altra, sul collo dell’astragalo, lo spinge dorsalmente mentre il piede viene portato in dorsiflessione), utile per recuperare la dorsiflessione necessaria al </w:t>
+        <w:t xml:space="preserve"> Alla caviglia il terapista esegue la trazione della talocrurale e lo scivolamento posteriore dell’astragalo (una mano stabilizza la tibia, l’altra spinge dorsalmente il collo dell’astragalo mentre il piede va in dorsiflessione), utile per il </w:t>
       </w:r>
       <w:r>
         <w:rPr>
@@ -5579,7 +4860,7 @@
           <w:sz w:val="24"/>
           <w:szCs w:val="24"/>
         </w:rPr>
-        <w:t xml:space="preserve">. Alla sottoastragalica esegue, con il calcagno nel palmo e la tibia stabilizzata, oscillazioni in inversione ed eversione e scivolamenti medio-laterali del calcagno. All’articolazione di Chopart mobilizza navicolare e cuboide in senso dorso-plantare, con attenzione allo scivolamento plantare del cuboide, spesso ridotto nel piede pronato. Alle articolazioni di Lisfranc esegue scivolamenti dorso-plantari, e alla prima metatarso-falangea trazione, scivolamento dorsale e mobilizzazione in estensione, nel rispetto del dolore, per l’ampiezza richiesta dal </w:t>
+        <w:t xml:space="preserve">. Alla sottoastragalica esegue, con il calcagno nel palmo, oscillazioni in inversione ed eversione; all’articolazione di Chopart mobilizza navicolare e cuboide in senso dorso-plantare, con attenzione allo scivolamento plantare del cuboide, spesso ridotto nel piede pronato. Alle articolazioni di Lisfranc esegue scivolamenti dorso-plantari, e alla prima metatarso-falangea trazione, scivolamento dorsale e mobilizzazione in estensione, nel rispetto del dolore, per l’ampiezza richiesta dal </w:t>
       </w:r>
       <w:r>
         <w:rPr>
@@ -5615,7 +4896,7 @@
           <w:sz w:val="24"/>
           <w:szCs w:val="24"/>
         </w:rPr>
-        <w:t xml:space="preserve"> oltre i limiti anatomici ma per favorire l’uso del range disponibile; al bacino propone mobilizzazioni funzionali in anteversione e retroversione associate alla respirazione. La mobilizzazione della caviglia può migliorare nel breve periodo la dorsiflessione in carico, ma con risultati eterogenei: il suo valore sta nell’integrazione immediata con l’esercizio attivo.</w:t>
+        <w:t xml:space="preserve"> oltre i limiti anatomici ma per favorire l’uso del range disponibile; al bacino propone mobilizzazioni funzionali in anteversione e retroversione associate alla respirazione. La mobilizzazione della caviglia può migliorare nel breve periodo la dorsiflessione, con risultati eterogenei: il suo valore sta nell’integrazione immediata con l’esercizio attivo.</w:t>
       </w:r>
     </w:p>
     <w:p>
@@ -5635,7 +4916,7 @@
           <w:sz w:val="24"/>
           <w:szCs w:val="24"/>
         </w:rPr>
-        <w:t xml:space="preserve">2.2.2 Esercizio attivo e rieducazione dell’appoggio</w:t>
+        <w:t xml:space="preserve">2.2.2 Massaggio miofasciale della pianta del piede e delle catene</w:t>
       </w:r>
     </w:p>
     <w:p>
@@ -5649,13 +4930,235 @@
           <w:sz w:val="24"/>
           <w:szCs w:val="24"/>
         </w:rPr>
-        <w:t xml:space="preserve">Il programma di esercizio, condiviso con il fisioterapista e l’insegnante di danza, è stato consegnato alla studentessa come lavoro quotidiano di 10-15 minuti e viene verificato all’inizio di ogni seduta; gli esercizi seguono una progressione dal controllo al carico.</w:t>
+        <w:t xml:space="preserve">La fascia è il tessuto connettivo continuo che avvolge e collega muscoli, tendini e ossa: la fascia superficiale sottocutanea, la fascia profonda (nella gamba la fascia crurale, che si continua nei retinacoli e nell’aponeurosi plantare) e le guaine di ogni muscolo. È ricca di meccanocettori e risponde al carico ripetuto e all’infiammazione con una “densificazione” della matrice tra gli strati, perdita di scorrimento e aumento della rigidità.</w:t>
       </w:r>
       <w:r>
         <w:rPr>
           <w:rStyle w:val="FootnoteReference"/>
         </w:rPr>
         <w:footnoteReference w:id="44"/>
+      </w:r>
+      <w:r>
+        <w:rPr>
+          <w:rFonts w:ascii="Times New Roman" w:cs="Times New Roman" w:eastAsia="Times New Roman" w:hAnsi="Times New Roman"/>
+          <w:sz w:val="24"/>
+          <w:szCs w:val="24"/>
+        </w:rPr>
+        <w:t xml:space="preserve"> Il massaggio miofasciale (o rilascio miofasciale) è la tecnica manuale che si rivolge a questo tessuto: si esegue senza olio, per non scivolare sulla pelle, con una pressione lenta, sostenuta e di intensità moderata che “aggancia” il tessuto, lo porta in tensione fino alla barriera di resistenza e la mantiene per 90-120 secondi, finché il terapista percepisce un cedimento (</w:t>
+      </w:r>
+      <w:r>
+        <w:rPr>
+          <w:rFonts w:ascii="Times New Roman" w:cs="Times New Roman" w:eastAsia="Times New Roman" w:hAnsi="Times New Roman"/>
+          <w:i/>
+          <w:iCs/>
+          <w:sz w:val="24"/>
+          <w:szCs w:val="24"/>
+        </w:rPr>
+        <w:t xml:space="preserve">release</w:t>
+      </w:r>
+      <w:r>
+        <w:rPr>
+          <w:rFonts w:ascii="Times New Roman" w:cs="Times New Roman" w:eastAsia="Times New Roman" w:hAnsi="Times New Roman"/>
+          <w:sz w:val="24"/>
+          <w:szCs w:val="24"/>
+        </w:rPr>
+        <w:t xml:space="preserve">) e segue il tessuto nella nuova direzione. Si distingue dal massaggio classico per l’assenza di scorrimento rapido, per i tempi lunghi, per la direzione guidata dalla restrizione e per il lavoro lungo le linee di continuità miofasciale, non solo sul punto dolente.</w:t>
+      </w:r>
+      <w:r>
+        <w:rPr>
+          <w:rStyle w:val="FootnoteReference"/>
+        </w:rPr>
+        <w:footnoteReference w:id="45"/>
+      </w:r>
+      <w:r>
+        <w:rPr>
+          <w:rFonts w:ascii="Times New Roman" w:cs="Times New Roman" w:eastAsia="Times New Roman" w:hAnsi="Times New Roman"/>
+          <w:sz w:val="24"/>
+          <w:szCs w:val="24"/>
+        </w:rPr>
+        <w:t xml:space="preserve"> L’effetto non è un allungamento meccanico permanente ma una modulazione del tono attraverso i meccanocettori fasciali e il sistema nervoso autonomo, con miglioramento dello scorrimento e della percezione della zona trattata.</w:t>
+      </w:r>
+    </w:p>
+    <w:p>
+      <w:pPr>
+        <w:spacing w:after="120" w:line="360"/>
+        <w:jc w:val="both"/>
+      </w:pPr>
+      <w:r>
+        <w:rPr>
+          <w:rFonts w:ascii="Times New Roman" w:cs="Times New Roman" w:eastAsia="Times New Roman" w:hAnsi="Times New Roman"/>
+          <w:sz w:val="24"/>
+          <w:szCs w:val="24"/>
+        </w:rPr>
+        <w:t xml:space="preserve">Nel piede piatto-pronato la tecnica è particolarmente indicata perché le strutture che cedono o compensano sono in gran parte fasciali: l’aponeurosi plantare, tesa dalla pronazione prolungata e sede di densificazioni e dolore inserzionale; la fascia profonda del compartimento posteriore, che avvolge tibiale posteriore e flessori lunghi; il tendine d’Achille e la linea superficiale posteriore, la cui rigidità limita la dorsiflessione e “ruba” profondità al </w:t>
+      </w:r>
+      <w:r>
+        <w:rPr>
+          <w:rFonts w:ascii="Times New Roman" w:cs="Times New Roman" w:eastAsia="Times New Roman" w:hAnsi="Times New Roman"/>
+          <w:i/>
+          <w:iCs/>
+          <w:sz w:val="24"/>
+          <w:szCs w:val="24"/>
+        </w:rPr>
+        <w:t xml:space="preserve">plié</w:t>
+      </w:r>
+      <w:r>
+        <w:rPr>
+          <w:rFonts w:ascii="Times New Roman" w:cs="Times New Roman" w:eastAsia="Times New Roman" w:hAnsi="Times New Roman"/>
+          <w:sz w:val="24"/>
+          <w:szCs w:val="24"/>
+        </w:rPr>
+        <w:t xml:space="preserve">; i retinacoli e le guaine tendinee, irritati dagli scorrimenti ripetuti. Una revisione sistematica indica effetti favorevoli del rilascio miofasciale su dolore e funzione in diverse condizioni muscoloscheletriche, inclusa la fascite plantare, pur con qualità variabile degli studi;</w:t>
+      </w:r>
+      <w:r>
+        <w:rPr>
+          <w:rStyle w:val="FootnoteReference"/>
+        </w:rPr>
+        <w:footnoteReference w:id="46"/>
+      </w:r>
+      <w:r>
+        <w:rPr>
+          <w:rFonts w:ascii="Times New Roman" w:cs="Times New Roman" w:eastAsia="Times New Roman" w:hAnsi="Times New Roman"/>
+          <w:sz w:val="24"/>
+          <w:szCs w:val="24"/>
+        </w:rPr>
+        <w:t xml:space="preserve"> uno studio pilota ha mostrato che l’auto-rilascio della sola pianta con una pallina migliora subito la flessibilità di ischiocrurali e rachide lombare, a conferma della continuità della catena posteriore.</w:t>
+      </w:r>
+      <w:r>
+        <w:rPr>
+          <w:rStyle w:val="FootnoteReference"/>
+        </w:rPr>
+        <w:footnoteReference w:id="47"/>
+      </w:r>
+      <w:r>
+        <w:rPr>
+          <w:rFonts w:ascii="Times New Roman" w:cs="Times New Roman" w:eastAsia="Times New Roman" w:hAnsi="Times New Roman"/>
+          <w:sz w:val="24"/>
+          <w:szCs w:val="24"/>
+        </w:rPr>
+        <w:t xml:space="preserve"> Gli obiettivi sono restituire scorrimento ai tessuti plantari e della gamba, favorire la dorsiflessione e riattivare la propriocezione plantare prima dell’esercizio.</w:t>
+      </w:r>
+    </w:p>
+    <w:p>
+      <w:pPr>
+        <w:spacing w:after="120" w:line="360"/>
+        <w:jc w:val="both"/>
+      </w:pPr>
+      <w:r>
+        <w:rPr>
+          <w:rFonts w:ascii="Times New Roman" w:cs="Times New Roman" w:eastAsia="Times New Roman" w:hAnsi="Times New Roman"/>
+          <w:sz w:val="24"/>
+          <w:szCs w:val="24"/>
+        </w:rPr>
+        <w:t xml:space="preserve">Sulla pianta del piede il terapista lavora con la persona prona a ginocchio flesso, a mani asciutte. Esegue il rilascio dell’aponeurosi a mani incrociate: una mano sul tubercolo mediale del calcagno e l’altra sulle teste metatarsali, porta i tessuti in leggera tensione in direzioni opposte e mantiene 90-120 secondi, seguendo il cedimento, per le tre bande (mediale, centrale, laterale). Prosegue in posizione di </w:t>
+      </w:r>
+      <w:r>
+        <w:rPr>
+          <w:rFonts w:ascii="Times New Roman" w:cs="Times New Roman" w:eastAsia="Times New Roman" w:hAnsi="Times New Roman"/>
+          <w:i/>
+          <w:iCs/>
+          <w:sz w:val="24"/>
+          <w:szCs w:val="24"/>
+        </w:rPr>
+        <w:t xml:space="preserve">windlass</w:t>
+      </w:r>
+      <w:r>
+        <w:rPr>
+          <w:rFonts w:ascii="Times New Roman" w:cs="Times New Roman" w:eastAsia="Times New Roman" w:hAnsi="Times New Roman"/>
+          <w:sz w:val="24"/>
+          <w:szCs w:val="24"/>
+        </w:rPr>
+        <w:t xml:space="preserve">: con le dita estese passivamente l’aponeurosi è tesa e il terapista esegue pressioni lente e scorrimenti lentissimi dal calcagno verso le dita con il pollice o le nocche, fermandosi sulle aree più dense senza superare un fastidio sopportabile. Tratta poi i setti tra abduttore dell’alluce e flessore breve delle dita e il margine laterale con pressioni mantenute, mobilizza la fascia superficiale del margine mediale dell’arco con il pinzamento-rotolamento della cute (</w:t>
+      </w:r>
+      <w:r>
+        <w:rPr>
+          <w:rFonts w:ascii="Times New Roman" w:cs="Times New Roman" w:eastAsia="Times New Roman" w:hAnsi="Times New Roman"/>
+          <w:i/>
+          <w:iCs/>
+          <w:sz w:val="24"/>
+          <w:szCs w:val="24"/>
+        </w:rPr>
+        <w:t xml:space="preserve">skin rolling</w:t>
+      </w:r>
+      <w:r>
+        <w:rPr>
+          <w:rFonts w:ascii="Times New Roman" w:cs="Times New Roman" w:eastAsia="Times New Roman" w:hAnsi="Times New Roman"/>
+          <w:sz w:val="24"/>
+          <w:szCs w:val="24"/>
+        </w:rPr>
+        <w:t xml:space="preserve">) e rilascia l’inserzione calcaneare e il retinacolo dei flessori con pressioni mantenute. Dove possibile associa il movimento attivo (</w:t>
+      </w:r>
+      <w:r>
+        <w:rPr>
+          <w:rFonts w:ascii="Times New Roman" w:cs="Times New Roman" w:eastAsia="Times New Roman" w:hAnsi="Times New Roman"/>
+          <w:i/>
+          <w:iCs/>
+          <w:sz w:val="24"/>
+          <w:szCs w:val="24"/>
+        </w:rPr>
+        <w:t xml:space="preserve">pin and stretch</w:t>
+      </w:r>
+      <w:r>
+        <w:rPr>
+          <w:rFonts w:ascii="Times New Roman" w:cs="Times New Roman" w:eastAsia="Times New Roman" w:hAnsi="Times New Roman"/>
+          <w:sz w:val="24"/>
+          <w:szCs w:val="24"/>
+        </w:rPr>
+        <w:t xml:space="preserve">), mantenendo la pressione su un punto denso mentre la persona flette ed estende le dita.</w:t>
+      </w:r>
+    </w:p>
+    <w:p>
+      <w:pPr>
+        <w:spacing w:after="120" w:line="360"/>
+        <w:jc w:val="both"/>
+      </w:pPr>
+      <w:r>
+        <w:rPr>
+          <w:rFonts w:ascii="Times New Roman" w:cs="Times New Roman" w:eastAsia="Times New Roman" w:hAnsi="Times New Roman"/>
+          <w:sz w:val="24"/>
+          <w:szCs w:val="24"/>
+        </w:rPr>
+        <w:t xml:space="preserve">Sulle catene il terapista segue la linea superficiale posteriore dal basso verso l’alto. Sul tendine d’Achille esegue una presa a pinza con mobilizzazione trasversale lenta dei margini; sul polpaccio il rilascio a mani incrociate del gastrocnemio (una mano prossimale e una distale che si allontanano lentamente) e poi del soleo a ginocchio flesso; sul setto intermuscolare postero-mediale, tra tibia e soleo, una pressione obliqua mantenuta che raggiunge la loggia del tibiale posteriore, associata a dorsiflessione e flessione plantare attive della caviglia; sugli ischiocrurali e sulla regione glutea rilasci longitudinali a mani incrociate e pressioni mantenute con il gomito morbido su piriforme e gluteo medio. In decubito laterale tratta la linea laterale (peronei e tratto ileo-tibiale) e in supino gli adduttori. Il lavoro dura 15-20 minuti e sostituisce la parte profonda delle fasi 1 e 2 a sedute alterne; alla studentessa viene insegnato l’auto-rilascio quotidiano con una pallina sotto la pianta e con il rullo sul polpaccio. Le precauzioni sono quelle del massaggio profondo: nessun rilascio diretto su un’inserzione in fase acuta (si lavora a distanza, sulla catena), su sospetta frattura da stress, flebite o cute lesa; nell’ipermobile la tecnica mira allo scorrimento, non all’allungamento.</w:t>
+      </w:r>
+    </w:p>
+    <w:p>
+      <w:pPr>
+        <w:pStyle w:val="Heading3"/>
+        <w:keepNext/>
+        <w:spacing w:after="100" w:before="180" w:line="360"/>
+      </w:pPr>
+      <w:r>
+        <w:rPr>
+          <w:rFonts w:ascii="Times New Roman" w:cs="Times New Roman" w:eastAsia="Times New Roman" w:hAnsi="Times New Roman"/>
+          <w:b/>
+          <w:bCs/>
+          <w:i/>
+          <w:iCs/>
+          <w:color w:val="000000"/>
+          <w:sz w:val="24"/>
+          <w:szCs w:val="24"/>
+        </w:rPr>
+        <w:t xml:space="preserve">2.2.3 Esercizio attivo e rieducazione dell’appoggio</w:t>
+      </w:r>
+    </w:p>
+    <w:p>
+      <w:pPr>
+        <w:spacing w:after="120" w:line="360"/>
+        <w:jc w:val="both"/>
+      </w:pPr>
+      <w:r>
+        <w:rPr>
+          <w:rFonts w:ascii="Times New Roman" w:cs="Times New Roman" w:eastAsia="Times New Roman" w:hAnsi="Times New Roman"/>
+          <w:sz w:val="24"/>
+          <w:szCs w:val="24"/>
+        </w:rPr>
+        <w:t xml:space="preserve">Il programma di esercizio, condiviso con fisioterapista e insegnante, è un lavoro quotidiano di 10-15 minuti verificato all’inizio di ogni seduta, con progressione dal controllo al carico.</w:t>
+      </w:r>
+      <w:r>
+        <w:rPr>
+          <w:rStyle w:val="FootnoteReference"/>
+        </w:rPr>
+        <w:footnoteReference w:id="48"/>
       </w:r>
     </w:p>
     <w:p>
@@ -5692,25 +5195,7 @@
           <w:sz w:val="24"/>
           <w:szCs w:val="24"/>
         </w:rPr>
-        <w:t xml:space="preserve"> o </w:t>
-      </w:r>
-      <w:r>
-        <w:rPr>
-          <w:rFonts w:ascii="Times New Roman" w:cs="Times New Roman" w:eastAsia="Times New Roman" w:hAnsi="Times New Roman"/>
-          <w:i/>
-          <w:iCs/>
-          <w:sz w:val="24"/>
-          <w:szCs w:val="24"/>
-        </w:rPr>
-        <w:t xml:space="preserve">doming</w:t>
-      </w:r>
-      <w:r>
-        <w:rPr>
-          <w:rFonts w:ascii="Times New Roman" w:cs="Times New Roman" w:eastAsia="Times New Roman" w:hAnsi="Times New Roman"/>
-          <w:sz w:val="24"/>
-          <w:szCs w:val="24"/>
-        </w:rPr>
-        <w:t xml:space="preserve">): da seduta e poi in piedi, la persona avvicina la testa del primo metatarso al calcagno senza flettere le dita, innalzando l’arco per 5-10 secondi; 10-15 ripetizioni per piede. Attiva gli intrinseci e insegna a percepire l’arco.</w:t>
+        <w:t xml:space="preserve">): da seduta e poi in piedi, la persona avvicina la testa del primo metatarso al calcagno senza flettere le dita, innalzando l’arco per 5-10 secondi; 10-15 ripetizioni per piede. Attiva gli intrinseci.</w:t>
       </w:r>
     </w:p>
     <w:p>
@@ -5766,7 +5251,7 @@
           <w:sz w:val="24"/>
           <w:szCs w:val="24"/>
         </w:rPr>
-        <w:t xml:space="preserve">Equilibrio monopodalico su superficie stabile e poi instabile, a occhi aperti e chiusi, con piede neutro e ginocchio allineato sul secondo dito; 3 ripetizioni da 30 secondi per lato, con progressione verso il </w:t>
+        <w:t xml:space="preserve">Equilibrio monopodalico su superficie stabile e poi instabile, a occhi aperti e chiusi, con piede neutro e ginocchio sul secondo dito; 3 ripetizioni da 30 secondi per lato, poi in </w:t>
       </w:r>
       <w:r>
         <w:rPr>
@@ -5784,7 +5269,7 @@
           <w:sz w:val="24"/>
           <w:szCs w:val="24"/>
         </w:rPr>
-        <w:t xml:space="preserve"> e le posizioni della danza.</w:t>
+        <w:t xml:space="preserve"> e nelle posizioni della danza.</w:t>
       </w:r>
     </w:p>
     <w:p>
@@ -5821,7 +5306,7 @@
           <w:sz w:val="24"/>
           <w:szCs w:val="24"/>
         </w:rPr>
-        <w:t xml:space="preserve"> con elastico, ponte gluteo con rotazione esterna, rotazioni esterne attive dell’anca in piedi; 3 serie da 12-15. La rotazione esterna deve nascere dall’anca e il piede riceverla senza cedere.</w:t>
+        <w:t xml:space="preserve"> con elastico, ponte gluteo con rotazione esterna, rotazioni esterne attive in piedi; 3 serie da 12-15. La rotazione deve nascere dall’anca e il piede riceverla senza cedere.</w:t>
       </w:r>
     </w:p>
     <w:p>
@@ -5841,7 +5326,7 @@
           <w:sz w:val="24"/>
           <w:szCs w:val="24"/>
         </w:rPr>
-        <w:t xml:space="preserve">2.2.3 Integrazione con il gesto tecnico ed educazione al carico</w:t>
+        <w:t xml:space="preserve">2.2.4 Integrazione con il gesto tecnico ed educazione al carico</w:t>
       </w:r>
     </w:p>
     <w:p>
@@ -5855,7 +5340,7 @@
           <w:sz w:val="24"/>
           <w:szCs w:val="24"/>
         </w:rPr>
-        <w:t xml:space="preserve">Il passaggio al gesto tecnico segue una progressione semplice: appoggio bipodalico consapevole sui tre punti del piede; trasferimenti di peso; </w:t>
+        <w:t xml:space="preserve">Il passaggio al gesto tecnico segue una progressione semplice: appoggio bipodalico sui tre punti del piede; trasferimenti di peso; </w:t>
       </w:r>
       <w:r>
         <w:rPr>
@@ -5873,7 +5358,7 @@
           <w:sz w:val="24"/>
           <w:szCs w:val="24"/>
         </w:rPr>
-        <w:t xml:space="preserve"> in prima posizione con </w:t>
+        <w:t xml:space="preserve"> in prima con </w:t>
       </w:r>
       <w:r>
         <w:rPr>
@@ -5891,7 +5376,7 @@
           <w:sz w:val="24"/>
           <w:szCs w:val="24"/>
         </w:rPr>
-        <w:t xml:space="preserve"> ridotto al range che l’anca consente, ginocchio sul secondo dito e tallone a terra; </w:t>
+        <w:t xml:space="preserve"> ridotto al range dell’anca, ginocchio sul secondo dito e tallone a terra; </w:t>
       </w:r>
       <w:r>
         <w:rPr>
@@ -5945,7 +5430,7 @@
           <w:sz w:val="24"/>
           <w:szCs w:val="24"/>
         </w:rPr>
-        <w:t xml:space="preserve"> aumentato solo se il retropiede resta controllato; infine piccoli salti con ricezione silenziosa. L’insegnante è stata coinvolta per correggere </w:t>
+        <w:t xml:space="preserve"> aumentato solo se il retropiede resta controllato; infine piccoli salti, mentre l’insegnante corregge </w:t>
       </w:r>
       <w:r>
         <w:rPr>
@@ -5981,7 +5466,7 @@
           <w:sz w:val="24"/>
           <w:szCs w:val="24"/>
         </w:rPr>
-        <w:t xml:space="preserve"> in lezione.</w:t>
+        <w:t xml:space="preserve">.</w:t>
       </w:r>
     </w:p>
     <w:p>
@@ -5995,7 +5480,7 @@
           <w:sz w:val="24"/>
           <w:szCs w:val="24"/>
         </w:rPr>
-        <w:t xml:space="preserve">Per l’educazione al carico sono stati concordati un giorno di riposo settimanale, l’alternanza dei giorni di punte con giorni più leggeri, il riscaldamento del piede prima della lezione con gli esercizi descritti, il controllo delle scarpette e il riconoscimento dei segnali di allarme che impongono la sospensione del carico e la valutazione sanitaria: dolore che aumenta in lezione o persiste a riposo, gonfiore, dolore osseo sul secondo metatarso o sul navicolare, incapacità di sollevare il tallone su una gamba, dolore posteriore acuto sulle punte. La rivalutazione finale considera comfort, qualità di </w:t>
+        <w:t xml:space="preserve">Per l’educazione al carico sono stati concordati un giorno di riposo settimanale, l’alternanza dei giorni di punte con giorni più leggeri, il riscaldamento del piede con auto-rilascio ed esercizi, il controllo delle scarpette e il riconoscimento dei segnali di allarme che impongono di sospendere il carico e chiedere una valutazione: dolore che aumenta in lezione o persiste a riposo, gonfiore, dolore osseo localizzato, incapacità di sollevare il tallone su una gamba, dolore posteriore acuto sulle punte. La rivalutazione finale considera comfort, </w:t>
       </w:r>
       <w:r>
         <w:rPr>
@@ -6013,7 +5498,7 @@
           <w:sz w:val="24"/>
           <w:szCs w:val="24"/>
         </w:rPr>
-        <w:t xml:space="preserve"> e </w:t>
+        <w:t xml:space="preserve">, </w:t>
       </w:r>
       <w:r>
         <w:rPr>
@@ -6199,7 +5684,7 @@
           <w:sz w:val="24"/>
           <w:szCs w:val="24"/>
         </w:rPr>
-        <w:t xml:space="preserve">. Le mobilizzazioni articolari, l’esercizio attivo, la rieducazione del gesto e l’educazione al carico trasformano il beneficio del lavoro manuale in una capacità funzionale. Il risultato da ricercare non è un arco visivamente più alto, ma un danzatore che tollera meglio il carico, controlla meglio l’appoggio e riconosce per tempo i segnali che richiedono il medico o il fisioterapista. In questa prospettiva il massaggiatore capo bagnino è una figura di supporto preziosa, a condizione che conosca l’anatomia su cui lavora e i confini entro i quali lavora.</w:t>
+        <w:t xml:space="preserve">. Il massaggio miofasciale della pianta e delle catene, le mobilizzazioni articolari, l’esercizio attivo, la rieducazione del gesto e l’educazione al carico trasformano il beneficio del lavoro manuale in una capacità funzionale. Il risultato da ricercare non è un arco visivamente più alto, ma un danzatore che tollera meglio il carico, controlla meglio l’appoggio e riconosce per tempo i segnali che richiedono il medico o il fisioterapista. In questa prospettiva il massaggiatore capo bagnino è una figura di supporto preziosa, a condizione che conosca l’anatomia su cui lavora e i confini entro i quali lavora.</w:t>
       </w:r>
     </w:p>
     <w:p>
@@ -6222,7 +5707,7 @@
     </w:p>
     <w:p>
       <w:pPr>
-        <w:spacing w:after="60" w:line="240"/>
+        <w:spacing w:after="40" w:line="240"/>
         <w:ind w:left="453" w:hanging="453"/>
         <w:jc w:val="both"/>
       </w:pPr>
@@ -6255,7 +5740,7 @@
     </w:p>
     <w:p>
       <w:pPr>
-        <w:spacing w:after="60" w:line="240"/>
+        <w:spacing w:after="40" w:line="240"/>
         <w:ind w:left="453" w:hanging="453"/>
         <w:jc w:val="both"/>
       </w:pPr>
@@ -6265,6 +5750,72 @@
           <w:sz w:val="22"/>
           <w:szCs w:val="22"/>
         </w:rPr>
+        <w:t xml:space="preserve">Ajimsha M.S., Al-Mudahka N.R., Al-Madzhar J.A., «Effectiveness of myofascial release: systematic review of randomized controlled trials», </w:t>
+      </w:r>
+      <w:r>
+        <w:rPr>
+          <w:rFonts w:ascii="Times New Roman" w:cs="Times New Roman" w:eastAsia="Times New Roman" w:hAnsi="Times New Roman"/>
+          <w:i/>
+          <w:iCs/>
+          <w:sz w:val="22"/>
+          <w:szCs w:val="22"/>
+        </w:rPr>
+        <w:t xml:space="preserve">Journal of Bodywork and Movement Therapies</w:t>
+      </w:r>
+      <w:r>
+        <w:rPr>
+          <w:rFonts w:ascii="Times New Roman" w:cs="Times New Roman" w:eastAsia="Times New Roman" w:hAnsi="Times New Roman"/>
+          <w:sz w:val="22"/>
+          <w:szCs w:val="22"/>
+        </w:rPr>
+        <w:t xml:space="preserve">, 19(1), 2015, pp. 102-112.</w:t>
+      </w:r>
+    </w:p>
+    <w:p>
+      <w:pPr>
+        <w:spacing w:after="40" w:line="240"/>
+        <w:ind w:left="453" w:hanging="453"/>
+        <w:jc w:val="both"/>
+      </w:pPr>
+      <w:r>
+        <w:rPr>
+          <w:rFonts w:ascii="Times New Roman" w:cs="Times New Roman" w:eastAsia="Times New Roman" w:hAnsi="Times New Roman"/>
+          <w:sz w:val="22"/>
+          <w:szCs w:val="22"/>
+        </w:rPr>
+        <w:t xml:space="preserve">Barnes J.F., </w:t>
+      </w:r>
+      <w:r>
+        <w:rPr>
+          <w:rFonts w:ascii="Times New Roman" w:cs="Times New Roman" w:eastAsia="Times New Roman" w:hAnsi="Times New Roman"/>
+          <w:i/>
+          <w:iCs/>
+          <w:sz w:val="22"/>
+          <w:szCs w:val="22"/>
+        </w:rPr>
+        <w:t xml:space="preserve">Myofascial Release: The Search for Excellence</w:t>
+      </w:r>
+      <w:r>
+        <w:rPr>
+          <w:rFonts w:ascii="Times New Roman" w:cs="Times New Roman" w:eastAsia="Times New Roman" w:hAnsi="Times New Roman"/>
+          <w:sz w:val="22"/>
+          <w:szCs w:val="22"/>
+        </w:rPr>
+        <w:t xml:space="preserve">, Rehabilitation Services, Paoli, 1990.</w:t>
+      </w:r>
+    </w:p>
+    <w:p>
+      <w:pPr>
+        <w:spacing w:after="40" w:line="240"/>
+        <w:ind w:left="453" w:hanging="453"/>
+        <w:jc w:val="both"/>
+      </w:pPr>
+      <w:r>
+        <w:rPr>
+          <w:rFonts w:ascii="Times New Roman" w:cs="Times New Roman" w:eastAsia="Times New Roman" w:hAnsi="Times New Roman"/>
+          <w:sz w:val="22"/>
+          <w:szCs w:val="22"/>
+        </w:rPr>
         <w:t xml:space="preserve">Beighton P., Solomon L., Soskolne C.L., «Articular mobility in an African population», </w:t>
       </w:r>
       <w:r>
@@ -6288,7 +5839,7 @@
     </w:p>
     <w:p>
       <w:pPr>
-        <w:spacing w:after="60" w:line="240"/>
+        <w:spacing w:after="40" w:line="240"/>
         <w:ind w:left="453" w:hanging="453"/>
         <w:jc w:val="both"/>
       </w:pPr>
@@ -6321,7 +5872,7 @@
     </w:p>
     <w:p>
       <w:pPr>
-        <w:spacing w:after="60" w:line="240"/>
+        <w:spacing w:after="40" w:line="240"/>
         <w:ind w:left="453" w:hanging="453"/>
         <w:jc w:val="both"/>
       </w:pPr>
@@ -6354,7 +5905,7 @@
     </w:p>
     <w:p>
       <w:pPr>
-        <w:spacing w:after="60" w:line="240"/>
+        <w:spacing w:after="40" w:line="240"/>
         <w:ind w:left="453" w:hanging="453"/>
         <w:jc w:val="both"/>
       </w:pPr>
@@ -6364,6 +5915,39 @@
           <w:sz w:val="22"/>
           <w:szCs w:val="22"/>
         </w:rPr>
+        <w:t xml:space="preserve">Grieve R., Goodwin F., Alfaki M., Bourton A.J., Jeffries C., Scott H., «The immediate effect of bilateral self myofascial release on the plantar surface of the feet on hamstring and lumbar spine flexibility: a pilot randomised controlled trial», </w:t>
+      </w:r>
+      <w:r>
+        <w:rPr>
+          <w:rFonts w:ascii="Times New Roman" w:cs="Times New Roman" w:eastAsia="Times New Roman" w:hAnsi="Times New Roman"/>
+          <w:i/>
+          <w:iCs/>
+          <w:sz w:val="22"/>
+          <w:szCs w:val="22"/>
+        </w:rPr>
+        <w:t xml:space="preserve">Journal of Bodywork and Movement Therapies</w:t>
+      </w:r>
+      <w:r>
+        <w:rPr>
+          <w:rFonts w:ascii="Times New Roman" w:cs="Times New Roman" w:eastAsia="Times New Roman" w:hAnsi="Times New Roman"/>
+          <w:sz w:val="22"/>
+          <w:szCs w:val="22"/>
+        </w:rPr>
+        <w:t xml:space="preserve">, 19(3), 2015, pp. 544-552.</w:t>
+      </w:r>
+    </w:p>
+    <w:p>
+      <w:pPr>
+        <w:spacing w:after="40" w:line="240"/>
+        <w:ind w:left="453" w:hanging="453"/>
+        <w:jc w:val="both"/>
+      </w:pPr>
+      <w:r>
+        <w:rPr>
+          <w:rFonts w:ascii="Times New Roman" w:cs="Times New Roman" w:eastAsia="Times New Roman" w:hAnsi="Times New Roman"/>
+          <w:sz w:val="22"/>
+          <w:szCs w:val="22"/>
+        </w:rPr>
         <w:t xml:space="preserve">Haas J.G., </w:t>
       </w:r>
       <w:r>
@@ -6387,7 +5971,7 @@
     </w:p>
     <w:p>
       <w:pPr>
-        <w:spacing w:after="60" w:line="240"/>
+        <w:spacing w:after="40" w:line="240"/>
         <w:ind w:left="453" w:hanging="453"/>
         <w:jc w:val="both"/>
       </w:pPr>
@@ -6420,7 +6004,7 @@
     </w:p>
     <w:p>
       <w:pPr>
-        <w:spacing w:after="60" w:line="240"/>
+        <w:spacing w:after="40" w:line="240"/>
         <w:ind w:left="453" w:hanging="453"/>
         <w:jc w:val="both"/>
       </w:pPr>
@@ -6453,7 +6037,7 @@
     </w:p>
     <w:p>
       <w:pPr>
-        <w:spacing w:after="60" w:line="240"/>
+        <w:spacing w:after="40" w:line="240"/>
         <w:ind w:left="453" w:hanging="453"/>
         <w:jc w:val="both"/>
       </w:pPr>
@@ -6486,7 +6070,7 @@
     </w:p>
     <w:p>
       <w:pPr>
-        <w:spacing w:after="60" w:line="240"/>
+        <w:spacing w:after="40" w:line="240"/>
         <w:ind w:left="453" w:hanging="453"/>
         <w:jc w:val="both"/>
       </w:pPr>
@@ -6519,7 +6103,7 @@
     </w:p>
     <w:p>
       <w:pPr>
-        <w:spacing w:after="60" w:line="240"/>
+        <w:spacing w:after="40" w:line="240"/>
         <w:ind w:left="453" w:hanging="453"/>
         <w:jc w:val="both"/>
       </w:pPr>
@@ -6552,7 +6136,7 @@
     </w:p>
     <w:p>
       <w:pPr>
-        <w:spacing w:after="60" w:line="240"/>
+        <w:spacing w:after="40" w:line="240"/>
         <w:ind w:left="453" w:hanging="453"/>
         <w:jc w:val="both"/>
       </w:pPr>
@@ -6585,7 +6169,7 @@
     </w:p>
     <w:p>
       <w:pPr>
-        <w:spacing w:after="60" w:line="240"/>
+        <w:spacing w:after="40" w:line="240"/>
         <w:ind w:left="453" w:hanging="453"/>
         <w:jc w:val="both"/>
       </w:pPr>
@@ -6618,7 +6202,7 @@
     </w:p>
     <w:p>
       <w:pPr>
-        <w:spacing w:after="60" w:line="240"/>
+        <w:spacing w:after="40" w:line="240"/>
         <w:ind w:left="453" w:hanging="453"/>
         <w:jc w:val="both"/>
       </w:pPr>
@@ -6651,7 +6235,7 @@
     </w:p>
     <w:p>
       <w:pPr>
-        <w:spacing w:after="60" w:line="240"/>
+        <w:spacing w:after="40" w:line="240"/>
         <w:ind w:left="453" w:hanging="453"/>
         <w:jc w:val="both"/>
       </w:pPr>
@@ -6684,7 +6268,7 @@
     </w:p>
     <w:p>
       <w:pPr>
-        <w:spacing w:after="60" w:line="240"/>
+        <w:spacing w:after="40" w:line="240"/>
         <w:ind w:left="453" w:hanging="453"/>
         <w:jc w:val="both"/>
       </w:pPr>
@@ -6717,7 +6301,7 @@
     </w:p>
     <w:p>
       <w:pPr>
-        <w:spacing w:after="60" w:line="240"/>
+        <w:spacing w:after="40" w:line="240"/>
         <w:ind w:left="453" w:hanging="453"/>
         <w:jc w:val="both"/>
       </w:pPr>
@@ -6750,7 +6334,7 @@
     </w:p>
     <w:p>
       <w:pPr>
-        <w:spacing w:after="60" w:line="240"/>
+        <w:spacing w:after="40" w:line="240"/>
         <w:ind w:left="453" w:hanging="453"/>
         <w:jc w:val="both"/>
       </w:pPr>
@@ -6783,7 +6367,7 @@
     </w:p>
     <w:p>
       <w:pPr>
-        <w:spacing w:after="60" w:line="240"/>
+        <w:spacing w:after="40" w:line="240"/>
         <w:ind w:left="453" w:hanging="453"/>
         <w:jc w:val="both"/>
       </w:pPr>
@@ -6816,7 +6400,7 @@
     </w:p>
     <w:p>
       <w:pPr>
-        <w:spacing w:after="60" w:line="240"/>
+        <w:spacing w:after="40" w:line="240"/>
         <w:ind w:left="453" w:hanging="453"/>
         <w:jc w:val="both"/>
       </w:pPr>
@@ -6849,7 +6433,7 @@
     </w:p>
     <w:p>
       <w:pPr>
-        <w:spacing w:after="60" w:line="240"/>
+        <w:spacing w:after="40" w:line="240"/>
         <w:ind w:left="453" w:hanging="453"/>
         <w:jc w:val="both"/>
       </w:pPr>
@@ -6859,6 +6443,39 @@
           <w:sz w:val="22"/>
           <w:szCs w:val="22"/>
         </w:rPr>
+        <w:t xml:space="preserve">Manheim C.J., </w:t>
+      </w:r>
+      <w:r>
+        <w:rPr>
+          <w:rFonts w:ascii="Times New Roman" w:cs="Times New Roman" w:eastAsia="Times New Roman" w:hAnsi="Times New Roman"/>
+          <w:i/>
+          <w:iCs/>
+          <w:sz w:val="22"/>
+          <w:szCs w:val="22"/>
+        </w:rPr>
+        <w:t xml:space="preserve">The Myofascial Release Manual</w:t>
+      </w:r>
+      <w:r>
+        <w:rPr>
+          <w:rFonts w:ascii="Times New Roman" w:cs="Times New Roman" w:eastAsia="Times New Roman" w:hAnsi="Times New Roman"/>
+          <w:sz w:val="22"/>
+          <w:szCs w:val="22"/>
+        </w:rPr>
+        <w:t xml:space="preserve">, 4ª ed., Slack, Thorofare, 2008.</w:t>
+      </w:r>
+    </w:p>
+    <w:p>
+      <w:pPr>
+        <w:spacing w:after="40" w:line="240"/>
+        <w:ind w:left="453" w:hanging="453"/>
+        <w:jc w:val="both"/>
+      </w:pPr>
+      <w:r>
+        <w:rPr>
+          <w:rFonts w:ascii="Times New Roman" w:cs="Times New Roman" w:eastAsia="Times New Roman" w:hAnsi="Times New Roman"/>
+          <w:sz w:val="22"/>
+          <w:szCs w:val="22"/>
+        </w:rPr>
         <w:t xml:space="preserve">Mosca V.S., «Flexible flatfoot in children and adolescents», </w:t>
       </w:r>
       <w:r>
@@ -6882,7 +6499,7 @@
     </w:p>
     <w:p>
       <w:pPr>
-        <w:spacing w:after="60" w:line="240"/>
+        <w:spacing w:after="40" w:line="240"/>
         <w:ind w:left="453" w:hanging="453"/>
         <w:jc w:val="both"/>
       </w:pPr>
@@ -6915,7 +6532,7 @@
     </w:p>
     <w:p>
       <w:pPr>
-        <w:spacing w:after="60" w:line="240"/>
+        <w:spacing w:after="40" w:line="240"/>
         <w:ind w:left="453" w:hanging="453"/>
         <w:jc w:val="both"/>
       </w:pPr>
@@ -6948,7 +6565,7 @@
     </w:p>
     <w:p>
       <w:pPr>
-        <w:spacing w:after="60" w:line="240"/>
+        <w:spacing w:after="40" w:line="240"/>
         <w:ind w:left="453" w:hanging="453"/>
         <w:jc w:val="both"/>
       </w:pPr>
@@ -6981,7 +6598,7 @@
     </w:p>
     <w:p>
       <w:pPr>
-        <w:spacing w:after="60" w:line="240"/>
+        <w:spacing w:after="40" w:line="240"/>
         <w:ind w:left="453" w:hanging="453"/>
         <w:jc w:val="both"/>
       </w:pPr>
@@ -7014,7 +6631,7 @@
     </w:p>
     <w:p>
       <w:pPr>
-        <w:spacing w:after="60" w:line="240"/>
+        <w:spacing w:after="40" w:line="240"/>
         <w:ind w:left="453" w:hanging="453"/>
         <w:jc w:val="both"/>
       </w:pPr>
@@ -7047,7 +6664,7 @@
     </w:p>
     <w:p>
       <w:pPr>
-        <w:spacing w:after="60" w:line="240"/>
+        <w:spacing w:after="40" w:line="240"/>
         <w:ind w:left="453" w:hanging="453"/>
         <w:jc w:val="both"/>
       </w:pPr>
@@ -7080,7 +6697,7 @@
     </w:p>
     <w:p>
       <w:pPr>
-        <w:spacing w:after="60" w:line="240"/>
+        <w:spacing w:after="40" w:line="240"/>
         <w:ind w:left="453" w:hanging="453"/>
         <w:jc w:val="both"/>
       </w:pPr>
@@ -7113,7 +6730,7 @@
     </w:p>
     <w:p>
       <w:pPr>
-        <w:spacing w:after="60" w:line="240"/>
+        <w:spacing w:after="40" w:line="240"/>
         <w:ind w:left="453" w:hanging="453"/>
         <w:jc w:val="both"/>
       </w:pPr>
@@ -7146,7 +6763,7 @@
     </w:p>
     <w:p>
       <w:pPr>
-        <w:spacing w:after="60" w:line="240"/>
+        <w:spacing w:after="40" w:line="240"/>
         <w:ind w:left="453" w:hanging="453"/>
         <w:jc w:val="both"/>
       </w:pPr>
@@ -7156,6 +6773,39 @@
           <w:sz w:val="22"/>
           <w:szCs w:val="22"/>
         </w:rPr>
+        <w:t xml:space="preserve">Schleip R., «Fascial plasticity – a new neurobiological explanation», </w:t>
+      </w:r>
+      <w:r>
+        <w:rPr>
+          <w:rFonts w:ascii="Times New Roman" w:cs="Times New Roman" w:eastAsia="Times New Roman" w:hAnsi="Times New Roman"/>
+          <w:i/>
+          <w:iCs/>
+          <w:sz w:val="22"/>
+          <w:szCs w:val="22"/>
+        </w:rPr>
+        <w:t xml:space="preserve">Journal of Bodywork and Movement Therapies</w:t>
+      </w:r>
+      <w:r>
+        <w:rPr>
+          <w:rFonts w:ascii="Times New Roman" w:cs="Times New Roman" w:eastAsia="Times New Roman" w:hAnsi="Times New Roman"/>
+          <w:sz w:val="22"/>
+          <w:szCs w:val="22"/>
+        </w:rPr>
+        <w:t xml:space="preserve">, 7(1), 2003, pp. 11-19.</w:t>
+      </w:r>
+    </w:p>
+    <w:p>
+      <w:pPr>
+        <w:spacing w:after="40" w:line="240"/>
+        <w:ind w:left="453" w:hanging="453"/>
+        <w:jc w:val="both"/>
+      </w:pPr>
+      <w:r>
+        <w:rPr>
+          <w:rFonts w:ascii="Times New Roman" w:cs="Times New Roman" w:eastAsia="Times New Roman" w:hAnsi="Times New Roman"/>
+          <w:sz w:val="22"/>
+          <w:szCs w:val="22"/>
+        </w:rPr>
         <w:t xml:space="preserve">Standring S. (a cura di), </w:t>
       </w:r>
       <w:r>
@@ -7179,7 +6829,7 @@
     </w:p>
     <w:p>
       <w:pPr>
-        <w:spacing w:after="60" w:line="240"/>
+        <w:spacing w:after="40" w:line="240"/>
         <w:ind w:left="453" w:hanging="453"/>
         <w:jc w:val="both"/>
       </w:pPr>
@@ -7189,6 +6839,39 @@
           <w:sz w:val="22"/>
           <w:szCs w:val="22"/>
         </w:rPr>
+        <w:t xml:space="preserve">Stecco C., </w:t>
+      </w:r>
+      <w:r>
+        <w:rPr>
+          <w:rFonts w:ascii="Times New Roman" w:cs="Times New Roman" w:eastAsia="Times New Roman" w:hAnsi="Times New Roman"/>
+          <w:i/>
+          <w:iCs/>
+          <w:sz w:val="22"/>
+          <w:szCs w:val="22"/>
+        </w:rPr>
+        <w:t xml:space="preserve">Functional Atlas of the Human Fascial System</w:t>
+      </w:r>
+      <w:r>
+        <w:rPr>
+          <w:rFonts w:ascii="Times New Roman" w:cs="Times New Roman" w:eastAsia="Times New Roman" w:hAnsi="Times New Roman"/>
+          <w:sz w:val="22"/>
+          <w:szCs w:val="22"/>
+        </w:rPr>
+        <w:t xml:space="preserve">, Churchill Livingstone Elsevier, Edinburgh, 2015.</w:t>
+      </w:r>
+    </w:p>
+    <w:p>
+      <w:pPr>
+        <w:spacing w:after="40" w:line="240"/>
+        <w:ind w:left="453" w:hanging="453"/>
+        <w:jc w:val="both"/>
+      </w:pPr>
+      <w:r>
+        <w:rPr>
+          <w:rFonts w:ascii="Times New Roman" w:cs="Times New Roman" w:eastAsia="Times New Roman" w:hAnsi="Times New Roman"/>
+          <w:sz w:val="22"/>
+          <w:szCs w:val="22"/>
+        </w:rPr>
         <w:t xml:space="preserve">Steinberg N., Hershkovitz I., Peleg S., Dar G., Masharawi Y., Heim M., Siev-Ner I., «Range of joint movement in female dancers and nondancers aged 8 to 16 years: anatomical and clinical implications», </w:t>
       </w:r>
       <w:r>
@@ -7212,7 +6895,7 @@
     </w:p>
     <w:p>
       <w:pPr>
-        <w:spacing w:after="60" w:line="240"/>
+        <w:spacing w:after="40" w:line="240"/>
         <w:ind w:left="453" w:hanging="453"/>
         <w:jc w:val="both"/>
       </w:pPr>
@@ -7245,7 +6928,7 @@
     </w:p>
     <w:p>
       <w:pPr>
-        <w:spacing w:after="60" w:line="240"/>
+        <w:spacing w:after="40" w:line="240"/>
         <w:ind w:left="453" w:hanging="453"/>
         <w:jc w:val="both"/>
       </w:pPr>
@@ -7297,7 +6980,7 @@
           <w:sz w:val="24"/>
           <w:szCs w:val="24"/>
         </w:rPr>
-        <w:t xml:space="preserve"> Le Figure 1, 2, 3, 7, 8, 9, 10 e 11 sono immagini illustrative realizzate per questa tesina e non documentano il soggetto descritto; gli schemi delle Figure 4, 5 e 6 sono elaborazioni originali dell’autrice sulla base delle fonti citate nelle didascalie.</w:t>
+        <w:t xml:space="preserve"> Le Figure 1, 2, 3, 7, 8, 9 e 10 sono immagini illustrative realizzate per questa tesina e non documentano il soggetto descritto; gli schemi delle Figure 4, 5 e 6 sono elaborazioni originali dell’autrice sulla base delle fonti citate nelle didascalie.</w:t>
       </w:r>
     </w:p>
     <w:sectPr>
@@ -9075,6 +8758,202 @@
     </w:p>
   </w:footnote>
   <w:footnote w:id="44">
+    <w:p>
+      <w:pPr>
+        <w:spacing w:line="240"/>
+        <w:jc w:val="both"/>
+      </w:pPr>
+      <w:r>
+        <w:rPr>
+          <w:rStyle w:val="FootnoteReference"/>
+        </w:rPr>
+        <w:footnoteRef/>
+      </w:r>
+      <w:r>
+        <w:rPr>
+          <w:rFonts w:ascii="Times New Roman" w:cs="Times New Roman" w:eastAsia="Times New Roman" w:hAnsi="Times New Roman"/>
+          <w:sz w:val="20"/>
+          <w:szCs w:val="20"/>
+        </w:rPr>
+        <w:t xml:space="preserve">Stecco C., </w:t>
+      </w:r>
+      <w:r>
+        <w:rPr>
+          <w:rFonts w:ascii="Times New Roman" w:cs="Times New Roman" w:eastAsia="Times New Roman" w:hAnsi="Times New Roman"/>
+          <w:i/>
+          <w:iCs/>
+          <w:sz w:val="20"/>
+          <w:szCs w:val="20"/>
+        </w:rPr>
+        <w:t xml:space="preserve">Functional Atlas of the Human Fascial System</w:t>
+      </w:r>
+      <w:r>
+        <w:rPr>
+          <w:rFonts w:ascii="Times New Roman" w:cs="Times New Roman" w:eastAsia="Times New Roman" w:hAnsi="Times New Roman"/>
+          <w:sz w:val="20"/>
+          <w:szCs w:val="20"/>
+        </w:rPr>
+        <w:t xml:space="preserve">, Churchill Livingstone Elsevier, Edinburgh, 2015; Schleip R., «Fascial plasticity – a new neurobiological explanation», </w:t>
+      </w:r>
+      <w:r>
+        <w:rPr>
+          <w:rFonts w:ascii="Times New Roman" w:cs="Times New Roman" w:eastAsia="Times New Roman" w:hAnsi="Times New Roman"/>
+          <w:i/>
+          <w:iCs/>
+          <w:sz w:val="20"/>
+          <w:szCs w:val="20"/>
+        </w:rPr>
+        <w:t xml:space="preserve">Journal of Bodywork and Movement Therapies</w:t>
+      </w:r>
+      <w:r>
+        <w:rPr>
+          <w:rFonts w:ascii="Times New Roman" w:cs="Times New Roman" w:eastAsia="Times New Roman" w:hAnsi="Times New Roman"/>
+          <w:sz w:val="20"/>
+          <w:szCs w:val="20"/>
+        </w:rPr>
+        <w:t xml:space="preserve">, 7(1), 2003, pp. 11-19.</w:t>
+      </w:r>
+    </w:p>
+  </w:footnote>
+  <w:footnote w:id="45">
+    <w:p>
+      <w:pPr>
+        <w:spacing w:line="240"/>
+        <w:jc w:val="both"/>
+      </w:pPr>
+      <w:r>
+        <w:rPr>
+          <w:rStyle w:val="FootnoteReference"/>
+        </w:rPr>
+        <w:footnoteRef/>
+      </w:r>
+      <w:r>
+        <w:rPr>
+          <w:rFonts w:ascii="Times New Roman" w:cs="Times New Roman" w:eastAsia="Times New Roman" w:hAnsi="Times New Roman"/>
+          <w:sz w:val="20"/>
+          <w:szCs w:val="20"/>
+        </w:rPr>
+        <w:t xml:space="preserve">Barnes J.F., </w:t>
+      </w:r>
+      <w:r>
+        <w:rPr>
+          <w:rFonts w:ascii="Times New Roman" w:cs="Times New Roman" w:eastAsia="Times New Roman" w:hAnsi="Times New Roman"/>
+          <w:i/>
+          <w:iCs/>
+          <w:sz w:val="20"/>
+          <w:szCs w:val="20"/>
+        </w:rPr>
+        <w:t xml:space="preserve">Myofascial Release: The Search for Excellence</w:t>
+      </w:r>
+      <w:r>
+        <w:rPr>
+          <w:rFonts w:ascii="Times New Roman" w:cs="Times New Roman" w:eastAsia="Times New Roman" w:hAnsi="Times New Roman"/>
+          <w:sz w:val="20"/>
+          <w:szCs w:val="20"/>
+        </w:rPr>
+        <w:t xml:space="preserve">, Rehabilitation Services, Paoli, 1990; Manheim C.J., </w:t>
+      </w:r>
+      <w:r>
+        <w:rPr>
+          <w:rFonts w:ascii="Times New Roman" w:cs="Times New Roman" w:eastAsia="Times New Roman" w:hAnsi="Times New Roman"/>
+          <w:i/>
+          <w:iCs/>
+          <w:sz w:val="20"/>
+          <w:szCs w:val="20"/>
+        </w:rPr>
+        <w:t xml:space="preserve">The Myofascial Release Manual</w:t>
+      </w:r>
+      <w:r>
+        <w:rPr>
+          <w:rFonts w:ascii="Times New Roman" w:cs="Times New Roman" w:eastAsia="Times New Roman" w:hAnsi="Times New Roman"/>
+          <w:sz w:val="20"/>
+          <w:szCs w:val="20"/>
+        </w:rPr>
+        <w:t xml:space="preserve">, 4ª ed., Slack, Thorofare, 2008.</w:t>
+      </w:r>
+    </w:p>
+  </w:footnote>
+  <w:footnote w:id="46">
+    <w:p>
+      <w:pPr>
+        <w:spacing w:line="240"/>
+        <w:jc w:val="both"/>
+      </w:pPr>
+      <w:r>
+        <w:rPr>
+          <w:rStyle w:val="FootnoteReference"/>
+        </w:rPr>
+        <w:footnoteRef/>
+      </w:r>
+      <w:r>
+        <w:rPr>
+          <w:rFonts w:ascii="Times New Roman" w:cs="Times New Roman" w:eastAsia="Times New Roman" w:hAnsi="Times New Roman"/>
+          <w:sz w:val="20"/>
+          <w:szCs w:val="20"/>
+        </w:rPr>
+        <w:t xml:space="preserve">Ajimsha M.S., Al-Mudahka N.R., Al-Madzhar J.A., «Effectiveness of myofascial release: systematic review of randomized controlled trials», </w:t>
+      </w:r>
+      <w:r>
+        <w:rPr>
+          <w:rFonts w:ascii="Times New Roman" w:cs="Times New Roman" w:eastAsia="Times New Roman" w:hAnsi="Times New Roman"/>
+          <w:i/>
+          <w:iCs/>
+          <w:sz w:val="20"/>
+          <w:szCs w:val="20"/>
+        </w:rPr>
+        <w:t xml:space="preserve">Journal of Bodywork and Movement Therapies</w:t>
+      </w:r>
+      <w:r>
+        <w:rPr>
+          <w:rFonts w:ascii="Times New Roman" w:cs="Times New Roman" w:eastAsia="Times New Roman" w:hAnsi="Times New Roman"/>
+          <w:sz w:val="20"/>
+          <w:szCs w:val="20"/>
+        </w:rPr>
+        <w:t xml:space="preserve">, 19(1), 2015, pp. 102-112.</w:t>
+      </w:r>
+    </w:p>
+  </w:footnote>
+  <w:footnote w:id="47">
+    <w:p>
+      <w:pPr>
+        <w:spacing w:line="240"/>
+        <w:jc w:val="both"/>
+      </w:pPr>
+      <w:r>
+        <w:rPr>
+          <w:rStyle w:val="FootnoteReference"/>
+        </w:rPr>
+        <w:footnoteRef/>
+      </w:r>
+      <w:r>
+        <w:rPr>
+          <w:rFonts w:ascii="Times New Roman" w:cs="Times New Roman" w:eastAsia="Times New Roman" w:hAnsi="Times New Roman"/>
+          <w:sz w:val="20"/>
+          <w:szCs w:val="20"/>
+        </w:rPr>
+        <w:t xml:space="preserve">Grieve R., Goodwin F., Alfaki M., Bourton A.J., Jeffries C., Scott H., «The immediate effect of bilateral self myofascial release on the plantar surface of the feet on hamstring and lumbar spine flexibility: a pilot randomised controlled trial», </w:t>
+      </w:r>
+      <w:r>
+        <w:rPr>
+          <w:rFonts w:ascii="Times New Roman" w:cs="Times New Roman" w:eastAsia="Times New Roman" w:hAnsi="Times New Roman"/>
+          <w:i/>
+          <w:iCs/>
+          <w:sz w:val="20"/>
+          <w:szCs w:val="20"/>
+        </w:rPr>
+        <w:t xml:space="preserve">Journal of Bodywork and Movement Therapies</w:t>
+      </w:r>
+      <w:r>
+        <w:rPr>
+          <w:rFonts w:ascii="Times New Roman" w:cs="Times New Roman" w:eastAsia="Times New Roman" w:hAnsi="Times New Roman"/>
+          <w:sz w:val="20"/>
+          <w:szCs w:val="20"/>
+        </w:rPr>
+        <w:t xml:space="preserve">, 19(3), 2015, pp. 544-552.</w:t>
+      </w:r>
+    </w:p>
+  </w:footnote>
+  <w:footnote w:id="48">
     <w:p>
       <w:pPr>
         <w:spacing w:line="240"/>

</xml_diff>